<commit_message>
docs: a szakdolgozat végleges verziója és a védési prezentáció
A dolgozat kiegészül az MI-használati nyilatkozattal (Claude, Gemini —
forráskód, szakirodalom, nyelvi gondozás), a kulcsszavak rövidülnek, a
DVD-melléklet leírása pedig a prezentációt és a forráskódot is nevesíti.

Co-Authored-By: Claude Opus 5 <noreply@anthropic.com>
Claude-Session: https://claude.ai/code/session_01Up2N6cmdFpDwFUwtwrUmwS
</commit_message>
<xml_diff>
--- a/szakdolgozat_Vass_Richard.docx
+++ b/szakdolgozat_Vass_Richard.docx
@@ -909,7 +909,7 @@
       </w:pPr>
       <w:r>
         <w:rPr/>
-        <w:t>Kulcsszavak: Android, e-hulladék, elosztott rendszer, FastAPI, mesterséges intelligencia, objektumdetekció, MQTT, konténerizáció</w:t>
+        <w:t>Kulcsszavak: Android, e-hulladék, FastAPI, konténerizáció, objektumdetekció</w:t>
       </w:r>
     </w:p>
     <w:p>
@@ -1662,7 +1662,7 @@
             <w:tab/>
             <w:t xml:space="preserve">A kamera-protokoll cseréje és annak következményei</w:t>
             <w:tab/>
-            <w:t>27</w:t>
+            <w:t>28</w:t>
           </w:r>
         </w:p>
         <w:p>
@@ -1685,7 +1685,7 @@
             <w:tab/>
             <w:t xml:space="preserve">Élőkép: az MJPEG-proxytól a go2rtc MSE-ig</w:t>
             <w:tab/>
-            <w:t>28</w:t>
+            <w:t>29</w:t>
           </w:r>
         </w:p>
         <w:p>
@@ -1754,7 +1754,7 @@
             <w:tab/>
             <w:t xml:space="preserve">Tűz- és füstérzékelés</w:t>
             <w:tab/>
-            <w:t>34</w:t>
+            <w:t>35</w:t>
           </w:r>
         </w:p>
         <w:p>
@@ -1777,7 +1777,7 @@
             <w:tab/>
             <w:t xml:space="preserve">A kezelőfelület</w:t>
             <w:tab/>
-            <w:t>36</w:t>
+            <w:t>37</w:t>
           </w:r>
         </w:p>
         <w:p>
@@ -1823,7 +1823,7 @@
             <w:tab/>
             <w:t xml:space="preserve">Hitelesítés és biztonsági megfontolások</w:t>
             <w:tab/>
-            <w:t>43</w:t>
+            <w:t>44</w:t>
           </w:r>
         </w:p>
         <w:p>
@@ -1846,7 +1846,7 @@
             <w:tab/>
             <w:t xml:space="preserve">Tesztelés és mérési eredmények</w:t>
             <w:tab/>
-            <w:t>44</w:t>
+            <w:t>45</w:t>
           </w:r>
         </w:p>
         <w:p>
@@ -1869,7 +1869,7 @@
             <w:tab/>
             <w:t xml:space="preserve">A mérési környezet és a módszertan</w:t>
             <w:tab/>
-            <w:t>44</w:t>
+            <w:t>45</w:t>
           </w:r>
         </w:p>
         <w:p>
@@ -1892,7 +1892,7 @@
             <w:tab/>
             <w:t xml:space="preserve">Erőforrás-használat a kameraszám függvényében</w:t>
             <w:tab/>
-            <w:t>45</w:t>
+            <w:t>47</w:t>
           </w:r>
         </w:p>
         <w:p>
@@ -1915,7 +1915,7 @@
             <w:tab/>
             <w:t xml:space="preserve">Detektálási sebesség: GPU-gyorsítás és processzoros futtatás</w:t>
             <w:tab/>
-            <w:t>47</w:t>
+            <w:t>48</w:t>
           </w:r>
         </w:p>
         <w:p>
@@ -1938,7 +1938,7 @@
             <w:tab/>
             <w:t xml:space="preserve">Eseménykésleltetés és az állapotfigyelés pontossága</w:t>
             <w:tab/>
-            <w:t>48</w:t>
+            <w:t>50</w:t>
           </w:r>
         </w:p>
         <w:p>
@@ -1961,7 +1961,7 @@
             <w:tab/>
             <w:t xml:space="preserve">Az élőkép architektúrájának mérése</w:t>
             <w:tab/>
-            <w:t>49</w:t>
+            <w:t>51</w:t>
           </w:r>
         </w:p>
         <w:p>
@@ -1984,7 +1984,7 @@
             <w:tab/>
             <w:t xml:space="preserve">A képsebesség fényfüggése – a telefonoldali korlát</w:t>
             <w:tab/>
-            <w:t>50</w:t>
+            <w:t>51</w:t>
           </w:r>
         </w:p>
         <w:p>
@@ -2007,7 +2007,7 @@
             <w:tab/>
             <w:t xml:space="preserve">Megfigyelt hibamódok</w:t>
             <w:tab/>
-            <w:t>51</w:t>
+            <w:t>53</w:t>
           </w:r>
         </w:p>
         <w:p>
@@ -2030,7 +2030,7 @@
             <w:tab/>
             <w:t xml:space="preserve">A megoldás korlátai</w:t>
             <w:tab/>
-            <w:t>52</w:t>
+            <w:t>53</w:t>
           </w:r>
         </w:p>
         <w:p>
@@ -2053,7 +2053,7 @@
             <w:tab/>
             <w:t xml:space="preserve">Tapasztalatok és tanulságok</w:t>
             <w:tab/>
-            <w:t>53</w:t>
+            <w:t>54</w:t>
           </w:r>
         </w:p>
         <w:p>
@@ -2076,7 +2076,7 @@
             <w:tab/>
             <w:t xml:space="preserve">Összegzés</w:t>
             <w:tab/>
-            <w:t>54</w:t>
+            <w:t>56</w:t>
           </w:r>
         </w:p>
         <w:p>
@@ -2099,7 +2099,7 @@
             <w:tab/>
             <w:t xml:space="preserve">Jövőbeli fejlesztési lehetőségek</w:t>
             <w:tab/>
-            <w:t>54</w:t>
+            <w:t>56</w:t>
           </w:r>
         </w:p>
         <w:p>
@@ -2121,7 +2121,7 @@
             <w:tab/>
             <w:t xml:space="preserve">Irodalom</w:t>
             <w:tab/>
-            <w:t>56</w:t>
+            <w:t>58</w:t>
           </w:r>
         </w:p>
         <w:p>
@@ -2144,7 +2144,7 @@
             <w:tab/>
             <w:t xml:space="preserve">Mellékletek</w:t>
             <w:tab/>
-            <w:t>58</w:t>
+            <w:t>60</w:t>
           </w:r>
         </w:p>
         <w:p>
@@ -2167,7 +2167,7 @@
             <w:tab/>
             <w:t xml:space="preserve">Nyomtatott mellékletek</w:t>
             <w:tab/>
-            <w:t>58</w:t>
+            <w:t>60</w:t>
           </w:r>
         </w:p>
         <w:p>
@@ -2190,7 +2190,7 @@
             <w:tab/>
             <w:t xml:space="preserve">Elektronikus mellékletek</w:t>
             <w:tab/>
-            <w:t>58</w:t>
+            <w:t>60</w:t>
           </w:r>
           <w:r>
             <w:rPr>
@@ -3755,6 +3755,7 @@
     <w:p>
       <w:pPr>
         <w:pStyle w:val="Caption"/>
+        <w:keepNext/>
       </w:pPr>
       <w:r>
         <w:t>1. táblázat: A felhőalapú és a helyben futó (edge) megfigyelési modell összehasonlítása</w:t>
@@ -3772,11 +3773,20 @@
         <w:gridCol w:w="3212"/>
       </w:tblGrid>
       <w:tr>
+        <w:trPr>
+          <w:cantSplit/>
+          <w:tblHeader/>
+        </w:trPr>
         <w:tc>
           <w:tcPr>
             <w:tcW w:type="dxa" w:w="3212"/>
-          </w:tcPr>
-          <w:p>
+            <w:shd w:val="clear" w:color="auto" w:fill="BFBFBF"/>
+          </w:tcPr>
+          <w:p>
+            <w:pPr>
+              <w:pStyle w:val="Normalfigure-table"/>
+              <w:keepNext/>
+            </w:pPr>
             <w:r>
               <w:rPr>
                 <w:b/>
@@ -3793,8 +3803,13 @@
         <w:tc>
           <w:tcPr>
             <w:tcW w:type="dxa" w:w="3212"/>
-          </w:tcPr>
-          <w:p>
+            <w:shd w:val="clear" w:color="auto" w:fill="BFBFBF"/>
+          </w:tcPr>
+          <w:p>
+            <w:pPr>
+              <w:pStyle w:val="Normalfigure-table"/>
+              <w:keepNext/>
+            </w:pPr>
             <w:r>
               <w:rPr>
                 <w:b/>
@@ -3811,8 +3826,13 @@
         <w:tc>
           <w:tcPr>
             <w:tcW w:type="dxa" w:w="3212"/>
-          </w:tcPr>
-          <w:p>
+            <w:shd w:val="clear" w:color="auto" w:fill="BFBFBF"/>
+          </w:tcPr>
+          <w:p>
+            <w:pPr>
+              <w:pStyle w:val="Normalfigure-table"/>
+              <w:keepNext/>
+            </w:pPr>
             <w:r>
               <w:rPr>
                 <w:b/>
@@ -3828,11 +3848,18 @@
         </w:tc>
       </w:tr>
       <w:tr>
+        <w:trPr>
+          <w:cantSplit/>
+        </w:trPr>
         <w:tc>
           <w:tcPr>
             <w:tcW w:type="dxa" w:w="3212"/>
           </w:tcPr>
           <w:p>
+            <w:pPr>
+              <w:pStyle w:val="Normalfigure-table"/>
+              <w:keepNext/>
+            </w:pPr>
             <w:r/>
             <w:r>
               <w:t>A videófolyam útja</w:t>
@@ -3844,6 +3871,10 @@
             <w:tcW w:type="dxa" w:w="3212"/>
           </w:tcPr>
           <w:p>
+            <w:pPr>
+              <w:pStyle w:val="Normalfigure-table"/>
+              <w:keepNext/>
+            </w:pPr>
             <w:r/>
             <w:r>
               <w:t>Elhagyja a háztartást, a gyártó szerverén dolgozódik fel</w:t>
@@ -3855,6 +3886,10 @@
             <w:tcW w:type="dxa" w:w="3212"/>
           </w:tcPr>
           <w:p>
+            <w:pPr>
+              <w:pStyle w:val="Normalfigure-table"/>
+              <w:keepNext/>
+            </w:pPr>
             <w:r/>
             <w:r>
               <w:t>Nem hagyja el a helyi hálózatot</w:t>
@@ -3863,11 +3898,18 @@
         </w:tc>
       </w:tr>
       <w:tr>
+        <w:trPr>
+          <w:cantSplit/>
+        </w:trPr>
         <w:tc>
           <w:tcPr>
             <w:tcW w:type="dxa" w:w="3212"/>
           </w:tcPr>
           <w:p>
+            <w:pPr>
+              <w:pStyle w:val="Normalfigure-table"/>
+              <w:keepNext/>
+            </w:pPr>
             <w:r/>
             <w:r>
               <w:t>Költségmodell</w:t>
@@ -3879,6 +3921,10 @@
             <w:tcW w:type="dxa" w:w="3212"/>
           </w:tcPr>
           <w:p>
+            <w:pPr>
+              <w:pStyle w:val="Normalfigure-table"/>
+              <w:keepNext/>
+            </w:pPr>
             <w:r/>
             <w:r>
               <w:t>Hardver + havi/éves előfizetés</w:t>
@@ -3890,6 +3936,10 @@
             <w:tcW w:type="dxa" w:w="3212"/>
           </w:tcPr>
           <w:p>
+            <w:pPr>
+              <w:pStyle w:val="Normalfigure-table"/>
+              <w:keepNext/>
+            </w:pPr>
             <w:r/>
             <w:r>
               <w:t>Egyszeri hardverköltség, előfizetés nélkül</w:t>
@@ -3898,11 +3948,18 @@
         </w:tc>
       </w:tr>
       <w:tr>
+        <w:trPr>
+          <w:cantSplit/>
+        </w:trPr>
         <w:tc>
           <w:tcPr>
             <w:tcW w:type="dxa" w:w="3212"/>
           </w:tcPr>
           <w:p>
+            <w:pPr>
+              <w:pStyle w:val="Normalfigure-table"/>
+              <w:keepNext/>
+            </w:pPr>
             <w:r/>
             <w:r>
               <w:t>Internetfüggés</w:t>
@@ -3914,6 +3971,10 @@
             <w:tcW w:type="dxa" w:w="3212"/>
           </w:tcPr>
           <w:p>
+            <w:pPr>
+              <w:pStyle w:val="Normalfigure-table"/>
+              <w:keepNext/>
+            </w:pPr>
             <w:r/>
             <w:r>
               <w:t>A működéshez folyamatos internetkapcsolat kell</w:t>
@@ -3925,6 +3986,10 @@
             <w:tcW w:type="dxa" w:w="3212"/>
           </w:tcPr>
           <w:p>
+            <w:pPr>
+              <w:pStyle w:val="Normalfigure-table"/>
+              <w:keepNext/>
+            </w:pPr>
             <w:r/>
             <w:r>
               <w:t>Internet nélkül is teljes értékű</w:t>
@@ -3933,11 +3998,18 @@
         </w:tc>
       </w:tr>
       <w:tr>
+        <w:trPr>
+          <w:cantSplit/>
+        </w:trPr>
         <w:tc>
           <w:tcPr>
             <w:tcW w:type="dxa" w:w="3212"/>
           </w:tcPr>
           <w:p>
+            <w:pPr>
+              <w:pStyle w:val="Normalfigure-table"/>
+              <w:keepNext/>
+            </w:pPr>
             <w:r/>
             <w:r>
               <w:t>Adatmegőrzés</w:t>
@@ -3949,6 +4021,10 @@
             <w:tcW w:type="dxa" w:w="3212"/>
           </w:tcPr>
           <w:p>
+            <w:pPr>
+              <w:pStyle w:val="Normalfigure-table"/>
+              <w:keepNext/>
+            </w:pPr>
             <w:r/>
             <w:r>
               <w:t>A szolgáltató szabályai és csomagja szerint</w:t>
@@ -3960,6 +4036,10 @@
             <w:tcW w:type="dxa" w:w="3212"/>
           </w:tcPr>
           <w:p>
+            <w:pPr>
+              <w:pStyle w:val="Normalfigure-table"/>
+              <w:keepNext/>
+            </w:pPr>
             <w:r/>
             <w:r>
               <w:t>A felhasználó dönti el, a lemezterület a korlát</w:t>
@@ -3968,11 +4048,18 @@
         </w:tc>
       </w:tr>
       <w:tr>
+        <w:trPr>
+          <w:cantSplit/>
+        </w:trPr>
         <w:tc>
           <w:tcPr>
             <w:tcW w:type="dxa" w:w="3212"/>
           </w:tcPr>
           <w:p>
+            <w:pPr>
+              <w:pStyle w:val="Normalfigure-table"/>
+              <w:keepNext/>
+            </w:pPr>
             <w:r/>
             <w:r>
               <w:t>Detekció helye</w:t>
@@ -3984,6 +4071,10 @@
             <w:tcW w:type="dxa" w:w="3212"/>
           </w:tcPr>
           <w:p>
+            <w:pPr>
+              <w:pStyle w:val="Normalfigure-table"/>
+              <w:keepNext/>
+            </w:pPr>
             <w:r/>
             <w:r>
               <w:t>Központi szerver, korlátlan kapacitással</w:t>
@@ -3995,6 +4086,10 @@
             <w:tcW w:type="dxa" w:w="3212"/>
           </w:tcPr>
           <w:p>
+            <w:pPr>
+              <w:pStyle w:val="Normalfigure-table"/>
+              <w:keepNext/>
+            </w:pPr>
             <w:r/>
             <w:r>
               <w:t>Helyi gép, a rendelkezésre álló CPU/GPU korlátain belül</w:t>
@@ -4003,11 +4098,18 @@
         </w:tc>
       </w:tr>
       <w:tr>
+        <w:trPr>
+          <w:cantSplit/>
+        </w:trPr>
         <w:tc>
           <w:tcPr>
             <w:tcW w:type="dxa" w:w="3212"/>
           </w:tcPr>
           <w:p>
+            <w:pPr>
+              <w:pStyle w:val="Normalfigure-table"/>
+              <w:keepNext/>
+            </w:pPr>
             <w:r/>
             <w:r>
               <w:t>Üzembe helyezés</w:t>
@@ -4019,6 +4121,10 @@
             <w:tcW w:type="dxa" w:w="3212"/>
           </w:tcPr>
           <w:p>
+            <w:pPr>
+              <w:pStyle w:val="Normalfigure-table"/>
+              <w:keepNext/>
+            </w:pPr>
             <w:r/>
             <w:r>
               <w:t>Néhány perc, hálózati ismeret nélkül</w:t>
@@ -4030,6 +4136,10 @@
             <w:tcW w:type="dxa" w:w="3212"/>
           </w:tcPr>
           <w:p>
+            <w:pPr>
+              <w:pStyle w:val="Normalfigure-table"/>
+              <w:keepNext/>
+            </w:pPr>
             <w:r/>
             <w:r>
               <w:t>Szerver, tárhely és kameránkénti konfiguráció szükséges</w:t>
@@ -4038,11 +4148,17 @@
         </w:tc>
       </w:tr>
       <w:tr>
+        <w:trPr>
+          <w:cantSplit/>
+        </w:trPr>
         <w:tc>
           <w:tcPr>
             <w:tcW w:type="dxa" w:w="3212"/>
           </w:tcPr>
           <w:p>
+            <w:pPr>
+              <w:pStyle w:val="Normalfigure-table"/>
+            </w:pPr>
             <w:r/>
             <w:r>
               <w:t>Bővíthetőség</w:t>
@@ -4054,6 +4170,9 @@
             <w:tcW w:type="dxa" w:w="3212"/>
           </w:tcPr>
           <w:p>
+            <w:pPr>
+              <w:pStyle w:val="Normalfigure-table"/>
+            </w:pPr>
             <w:r/>
             <w:r>
               <w:t>A gyártó ökoszisztémáján belül</w:t>
@@ -4065,6 +4184,9 @@
             <w:tcW w:type="dxa" w:w="3212"/>
           </w:tcPr>
           <w:p>
+            <w:pPr>
+              <w:pStyle w:val="Normalfigure-table"/>
+            </w:pPr>
             <w:r/>
             <w:r>
               <w:t>Bármilyen szabványos vagy egyedi forrás integrálható</w:t>
@@ -4142,6 +4264,7 @@
     <w:p>
       <w:pPr>
         <w:pStyle w:val="Caption"/>
+        <w:keepNext/>
       </w:pPr>
       <w:r>
         <w:t>2. táblázat: Kamerahardver-alternatívák összevetése a SwarmCam követelményei szerint</w:t>
@@ -4159,11 +4282,20 @@
         <w:gridCol w:w="3212"/>
       </w:tblGrid>
       <w:tr>
+        <w:trPr>
+          <w:cantSplit/>
+          <w:tblHeader/>
+        </w:trPr>
         <w:tc>
           <w:tcPr>
             <w:tcW w:type="dxa" w:w="3212"/>
-          </w:tcPr>
-          <w:p>
+            <w:shd w:val="clear" w:color="auto" w:fill="BFBFBF"/>
+          </w:tcPr>
+          <w:p>
+            <w:pPr>
+              <w:pStyle w:val="Normalfigure-table"/>
+              <w:keepNext/>
+            </w:pPr>
             <w:r>
               <w:rPr>
                 <w:b/>
@@ -4180,8 +4312,13 @@
         <w:tc>
           <w:tcPr>
             <w:tcW w:type="dxa" w:w="3212"/>
-          </w:tcPr>
-          <w:p>
+            <w:shd w:val="clear" w:color="auto" w:fill="BFBFBF"/>
+          </w:tcPr>
+          <w:p>
+            <w:pPr>
+              <w:pStyle w:val="Normalfigure-table"/>
+              <w:keepNext/>
+            </w:pPr>
             <w:r>
               <w:rPr>
                 <w:b/>
@@ -4198,8 +4335,13 @@
         <w:tc>
           <w:tcPr>
             <w:tcW w:type="dxa" w:w="3212"/>
-          </w:tcPr>
-          <w:p>
+            <w:shd w:val="clear" w:color="auto" w:fill="BFBFBF"/>
+          </w:tcPr>
+          <w:p>
+            <w:pPr>
+              <w:pStyle w:val="Normalfigure-table"/>
+              <w:keepNext/>
+            </w:pPr>
             <w:r>
               <w:rPr>
                 <w:b/>
@@ -4215,11 +4357,18 @@
         </w:tc>
       </w:tr>
       <w:tr>
+        <w:trPr>
+          <w:cantSplit/>
+        </w:trPr>
         <w:tc>
           <w:tcPr>
             <w:tcW w:type="dxa" w:w="3212"/>
           </w:tcPr>
           <w:p>
+            <w:pPr>
+              <w:pStyle w:val="Normalfigure-table"/>
+              <w:keepNext/>
+            </w:pPr>
             <w:r/>
             <w:r>
               <w:t>Beszerzési költség</w:t>
@@ -4231,6 +4380,10 @@
             <w:tcW w:type="dxa" w:w="3212"/>
           </w:tcPr>
           <w:p>
+            <w:pPr>
+              <w:pStyle w:val="Normalfigure-table"/>
+              <w:keepNext/>
+            </w:pPr>
             <w:r/>
             <w:r>
               <w:t>Kameránkénti, új hardver</w:t>
@@ -4242,6 +4395,10 @@
             <w:tcW w:type="dxa" w:w="3212"/>
           </w:tcPr>
           <w:p>
+            <w:pPr>
+              <w:pStyle w:val="Normalfigure-table"/>
+              <w:keepNext/>
+            </w:pPr>
             <w:r/>
             <w:r>
               <w:t>Nulla, a meglévő eszköz újrahasznosul</w:t>
@@ -4250,11 +4407,18 @@
         </w:tc>
       </w:tr>
       <w:tr>
+        <w:trPr>
+          <w:cantSplit/>
+        </w:trPr>
         <w:tc>
           <w:tcPr>
             <w:tcW w:type="dxa" w:w="3212"/>
           </w:tcPr>
           <w:p>
+            <w:pPr>
+              <w:pStyle w:val="Normalfigure-table"/>
+              <w:keepNext/>
+            </w:pPr>
             <w:r/>
             <w:r>
               <w:t>Szabványosság</w:t>
@@ -4266,6 +4430,10 @@
             <w:tcW w:type="dxa" w:w="3212"/>
           </w:tcPr>
           <w:p>
+            <w:pPr>
+              <w:pStyle w:val="Normalfigure-table"/>
+              <w:keepNext/>
+            </w:pPr>
             <w:r/>
             <w:r>
               <w:t>ONVIF Profile S, RTSP – jól dokumentált</w:t>
@@ -4277,6 +4445,10 @@
             <w:tcW w:type="dxa" w:w="3212"/>
           </w:tcPr>
           <w:p>
+            <w:pPr>
+              <w:pStyle w:val="Normalfigure-table"/>
+              <w:keepNext/>
+            </w:pPr>
             <w:r/>
             <w:r>
               <w:t>Alkalmazásfüggő, nem szabványos HTTP API</w:t>
@@ -4285,11 +4457,18 @@
         </w:tc>
       </w:tr>
       <w:tr>
+        <w:trPr>
+          <w:cantSplit/>
+        </w:trPr>
         <w:tc>
           <w:tcPr>
             <w:tcW w:type="dxa" w:w="3212"/>
           </w:tcPr>
           <w:p>
+            <w:pPr>
+              <w:pStyle w:val="Normalfigure-table"/>
+              <w:keepNext/>
+            </w:pPr>
             <w:r/>
             <w:r>
               <w:t>Videókodek</w:t>
@@ -4301,6 +4480,10 @@
             <w:tcW w:type="dxa" w:w="3212"/>
           </w:tcPr>
           <w:p>
+            <w:pPr>
+              <w:pStyle w:val="Normalfigure-table"/>
+              <w:keepNext/>
+            </w:pPr>
             <w:r/>
             <w:r>
               <w:t>H.264 / H.265, hardveres enkóder</w:t>
@@ -4312,6 +4495,10 @@
             <w:tcW w:type="dxa" w:w="3212"/>
           </w:tcPr>
           <w:p>
+            <w:pPr>
+              <w:pStyle w:val="Normalfigure-table"/>
+              <w:keepNext/>
+            </w:pPr>
             <w:r/>
             <w:r>
               <w:t>H.264, a telefon hardveres enkódere</w:t>
@@ -4320,11 +4507,18 @@
         </w:tc>
       </w:tr>
       <w:tr>
+        <w:trPr>
+          <w:cantSplit/>
+        </w:trPr>
         <w:tc>
           <w:tcPr>
             <w:tcW w:type="dxa" w:w="3212"/>
           </w:tcPr>
           <w:p>
+            <w:pPr>
+              <w:pStyle w:val="Normalfigure-table"/>
+              <w:keepNext/>
+            </w:pPr>
             <w:r/>
             <w:r>
               <w:t>Tápellátás</w:t>
@@ -4336,6 +4530,10 @@
             <w:tcW w:type="dxa" w:w="3212"/>
           </w:tcPr>
           <w:p>
+            <w:pPr>
+              <w:pStyle w:val="Normalfigure-table"/>
+              <w:keepNext/>
+            </w:pPr>
             <w:r/>
             <w:r>
               <w:t>PoE vagy hálózati adapter, folyamatos</w:t>
@@ -4347,6 +4545,10 @@
             <w:tcW w:type="dxa" w:w="3212"/>
           </w:tcPr>
           <w:p>
+            <w:pPr>
+              <w:pStyle w:val="Normalfigure-table"/>
+              <w:keepNext/>
+            </w:pPr>
             <w:r/>
             <w:r>
               <w:t>Töltőről; az akkumulátor pufferként is működik</w:t>
@@ -4355,11 +4557,18 @@
         </w:tc>
       </w:tr>
       <w:tr>
+        <w:trPr>
+          <w:cantSplit/>
+        </w:trPr>
         <w:tc>
           <w:tcPr>
             <w:tcW w:type="dxa" w:w="3212"/>
           </w:tcPr>
           <w:p>
+            <w:pPr>
+              <w:pStyle w:val="Normalfigure-table"/>
+              <w:keepNext/>
+            </w:pPr>
             <w:r/>
             <w:r>
               <w:t>Kiegészítő szenzorok</w:t>
@@ -4371,6 +4580,10 @@
             <w:tcW w:type="dxa" w:w="3212"/>
           </w:tcPr>
           <w:p>
+            <w:pPr>
+              <w:pStyle w:val="Normalfigure-table"/>
+              <w:keepNext/>
+            </w:pPr>
             <w:r/>
             <w:r>
               <w:t>Nincsenek (esetleg mikrofon)</w:t>
@@ -4382,6 +4595,10 @@
             <w:tcW w:type="dxa" w:w="3212"/>
           </w:tcPr>
           <w:p>
+            <w:pPr>
+              <w:pStyle w:val="Normalfigure-table"/>
+              <w:keepNext/>
+            </w:pPr>
             <w:r/>
             <w:r>
               <w:t>Mikrofon, gyorsulásmérő, giroszkóp, fényérzékelő, akkumulátor-állapot</w:t>
@@ -4390,11 +4607,18 @@
         </w:tc>
       </w:tr>
       <w:tr>
+        <w:trPr>
+          <w:cantSplit/>
+        </w:trPr>
         <w:tc>
           <w:tcPr>
             <w:tcW w:type="dxa" w:w="3212"/>
           </w:tcPr>
           <w:p>
+            <w:pPr>
+              <w:pStyle w:val="Normalfigure-table"/>
+              <w:keepNext/>
+            </w:pPr>
             <w:r/>
             <w:r>
               <w:t>Időjárásállóság</w:t>
@@ -4406,6 +4630,10 @@
             <w:tcW w:type="dxa" w:w="3212"/>
           </w:tcPr>
           <w:p>
+            <w:pPr>
+              <w:pStyle w:val="Normalfigure-table"/>
+              <w:keepNext/>
+            </w:pPr>
             <w:r/>
             <w:r>
               <w:t>IP66/IP67 kültéri kivitel</w:t>
@@ -4417,6 +4645,10 @@
             <w:tcW w:type="dxa" w:w="3212"/>
           </w:tcPr>
           <w:p>
+            <w:pPr>
+              <w:pStyle w:val="Normalfigure-table"/>
+              <w:keepNext/>
+            </w:pPr>
             <w:r/>
             <w:r>
               <w:t>Nincs, védett elhelyezést igényel</w:t>
@@ -4425,11 +4657,18 @@
         </w:tc>
       </w:tr>
       <w:tr>
+        <w:trPr>
+          <w:cantSplit/>
+        </w:trPr>
         <w:tc>
           <w:tcPr>
             <w:tcW w:type="dxa" w:w="3212"/>
           </w:tcPr>
           <w:p>
+            <w:pPr>
+              <w:pStyle w:val="Normalfigure-table"/>
+              <w:keepNext/>
+            </w:pPr>
             <w:r/>
             <w:r>
               <w:t>Élettartam-kockázat</w:t>
@@ -4441,6 +4680,10 @@
             <w:tcW w:type="dxa" w:w="3212"/>
           </w:tcPr>
           <w:p>
+            <w:pPr>
+              <w:pStyle w:val="Normalfigure-table"/>
+              <w:keepNext/>
+            </w:pPr>
             <w:r/>
             <w:r>
               <w:t>Alacsony</w:t>
@@ -4452,6 +4695,10 @@
             <w:tcW w:type="dxa" w:w="3212"/>
           </w:tcPr>
           <w:p>
+            <w:pPr>
+              <w:pStyle w:val="Normalfigure-table"/>
+              <w:keepNext/>
+            </w:pPr>
             <w:r/>
             <w:r>
               <w:t>Akkumulátor-degradáció, hőterhelés, elavuló Android-verzió</w:t>
@@ -4460,11 +4707,17 @@
         </w:tc>
       </w:tr>
       <w:tr>
+        <w:trPr>
+          <w:cantSplit/>
+        </w:trPr>
         <w:tc>
           <w:tcPr>
             <w:tcW w:type="dxa" w:w="3212"/>
           </w:tcPr>
           <w:p>
+            <w:pPr>
+              <w:pStyle w:val="Normalfigure-table"/>
+            </w:pPr>
             <w:r/>
             <w:r>
               <w:t>Automatikus felderítés</w:t>
@@ -4476,6 +4729,9 @@
             <w:tcW w:type="dxa" w:w="3212"/>
           </w:tcPr>
           <w:p>
+            <w:pPr>
+              <w:pStyle w:val="Normalfigure-table"/>
+            </w:pPr>
             <w:r/>
             <w:r>
               <w:t>ONVIF WS-Discovery</w:t>
@@ -4487,6 +4743,9 @@
             <w:tcW w:type="dxa" w:w="3212"/>
           </w:tcPr>
           <w:p>
+            <w:pPr>
+              <w:pStyle w:val="Normalfigure-table"/>
+            </w:pPr>
             <w:r/>
             <w:r>
               <w:t>Egyedi fingerprinting szükséges</w:t>
@@ -4636,6 +4895,7 @@
     <w:p>
       <w:pPr>
         <w:pStyle w:val="Caption"/>
+        <w:keepNext/>
       </w:pPr>
       <w:r>
         <w:t>3. táblázat: A kommunikációs minták és jellemzőik</w:t>
@@ -4654,11 +4914,20 @@
         <w:gridCol w:w="2409"/>
       </w:tblGrid>
       <w:tr>
+        <w:trPr>
+          <w:cantSplit/>
+          <w:tblHeader/>
+        </w:trPr>
         <w:tc>
           <w:tcPr>
             <w:tcW w:type="dxa" w:w="2409"/>
-          </w:tcPr>
-          <w:p>
+            <w:shd w:val="clear" w:color="auto" w:fill="BFBFBF"/>
+          </w:tcPr>
+          <w:p>
+            <w:pPr>
+              <w:pStyle w:val="Normalfigure-table"/>
+              <w:keepNext/>
+            </w:pPr>
             <w:r>
               <w:rPr>
                 <w:b/>
@@ -4675,8 +4944,13 @@
         <w:tc>
           <w:tcPr>
             <w:tcW w:type="dxa" w:w="2409"/>
-          </w:tcPr>
-          <w:p>
+            <w:shd w:val="clear" w:color="auto" w:fill="BFBFBF"/>
+          </w:tcPr>
+          <w:p>
+            <w:pPr>
+              <w:pStyle w:val="Normalfigure-table"/>
+              <w:keepNext/>
+            </w:pPr>
             <w:r>
               <w:rPr>
                 <w:b/>
@@ -4693,8 +4967,13 @@
         <w:tc>
           <w:tcPr>
             <w:tcW w:type="dxa" w:w="2409"/>
-          </w:tcPr>
-          <w:p>
+            <w:shd w:val="clear" w:color="auto" w:fill="BFBFBF"/>
+          </w:tcPr>
+          <w:p>
+            <w:pPr>
+              <w:pStyle w:val="Normalfigure-table"/>
+              <w:keepNext/>
+            </w:pPr>
             <w:r>
               <w:rPr>
                 <w:b/>
@@ -4711,8 +4990,13 @@
         <w:tc>
           <w:tcPr>
             <w:tcW w:type="dxa" w:w="2409"/>
-          </w:tcPr>
-          <w:p>
+            <w:shd w:val="clear" w:color="auto" w:fill="BFBFBF"/>
+          </w:tcPr>
+          <w:p>
+            <w:pPr>
+              <w:pStyle w:val="Normalfigure-table"/>
+              <w:keepNext/>
+            </w:pPr>
             <w:r>
               <w:rPr>
                 <w:b/>
@@ -4728,11 +5012,18 @@
         </w:tc>
       </w:tr>
       <w:tr>
+        <w:trPr>
+          <w:cantSplit/>
+        </w:trPr>
         <w:tc>
           <w:tcPr>
             <w:tcW w:type="dxa" w:w="2409"/>
           </w:tcPr>
           <w:p>
+            <w:pPr>
+              <w:pStyle w:val="Normalfigure-table"/>
+              <w:keepNext/>
+            </w:pPr>
             <w:r/>
             <w:r>
               <w:t>REST / HTTP</w:t>
@@ -4744,6 +5035,10 @@
             <w:tcW w:type="dxa" w:w="2409"/>
           </w:tcPr>
           <w:p>
+            <w:pPr>
+              <w:pStyle w:val="Normalfigure-table"/>
+              <w:keepNext/>
+            </w:pPr>
             <w:r/>
             <w:r>
               <w:t>Kliens kérdez, szerver válaszol</w:t>
@@ -4755,6 +5050,10 @@
             <w:tcW w:type="dxa" w:w="2409"/>
           </w:tcPr>
           <w:p>
+            <w:pPr>
+              <w:pStyle w:val="Normalfigure-table"/>
+              <w:keepNext/>
+            </w:pPr>
             <w:r/>
             <w:r>
               <w:t>Rövid életű, állapotmentes</w:t>
@@ -4766,6 +5065,10 @@
             <w:tcW w:type="dxa" w:w="2409"/>
           </w:tcPr>
           <w:p>
+            <w:pPr>
+              <w:pStyle w:val="Normalfigure-table"/>
+              <w:keepNext/>
+            </w:pPr>
             <w:r/>
             <w:r>
               <w:t>Erőforrás-lekérés és -módosítás</w:t>
@@ -4774,11 +5077,18 @@
         </w:tc>
       </w:tr>
       <w:tr>
+        <w:trPr>
+          <w:cantSplit/>
+        </w:trPr>
         <w:tc>
           <w:tcPr>
             <w:tcW w:type="dxa" w:w="2409"/>
           </w:tcPr>
           <w:p>
+            <w:pPr>
+              <w:pStyle w:val="Normalfigure-table"/>
+              <w:keepNext/>
+            </w:pPr>
             <w:r/>
             <w:r>
               <w:t>WebSocket</w:t>
@@ -4790,6 +5100,10 @@
             <w:tcW w:type="dxa" w:w="2409"/>
           </w:tcPr>
           <w:p>
+            <w:pPr>
+              <w:pStyle w:val="Normalfigure-table"/>
+              <w:keepNext/>
+            </w:pPr>
             <w:r/>
             <w:r>
               <w:t>Kétirányú</w:t>
@@ -4801,6 +5115,10 @@
             <w:tcW w:type="dxa" w:w="2409"/>
           </w:tcPr>
           <w:p>
+            <w:pPr>
+              <w:pStyle w:val="Normalfigure-table"/>
+              <w:keepNext/>
+            </w:pPr>
             <w:r/>
             <w:r>
               <w:t>Tartós, állapotot hordoz</w:t>
@@ -4812,6 +5130,10 @@
             <w:tcW w:type="dxa" w:w="2409"/>
           </w:tcPr>
           <w:p>
+            <w:pPr>
+              <w:pStyle w:val="Normalfigure-table"/>
+              <w:keepNext/>
+            </w:pPr>
             <w:r/>
             <w:r>
               <w:t>Folyamatos állapotfrissítés, riasztás</w:t>
@@ -4820,11 +5142,18 @@
         </w:tc>
       </w:tr>
       <w:tr>
+        <w:trPr>
+          <w:cantSplit/>
+        </w:trPr>
         <w:tc>
           <w:tcPr>
             <w:tcW w:type="dxa" w:w="2409"/>
           </w:tcPr>
           <w:p>
+            <w:pPr>
+              <w:pStyle w:val="Normalfigure-table"/>
+              <w:keepNext/>
+            </w:pPr>
             <w:r/>
             <w:r>
               <w:t>SSE</w:t>
@@ -4836,6 +5165,10 @@
             <w:tcW w:type="dxa" w:w="2409"/>
           </w:tcPr>
           <w:p>
+            <w:pPr>
+              <w:pStyle w:val="Normalfigure-table"/>
+              <w:keepNext/>
+            </w:pPr>
             <w:r/>
             <w:r>
               <w:t>Csak szerver → kliens</w:t>
@@ -4847,6 +5180,10 @@
             <w:tcW w:type="dxa" w:w="2409"/>
           </w:tcPr>
           <w:p>
+            <w:pPr>
+              <w:pStyle w:val="Normalfigure-table"/>
+              <w:keepNext/>
+            </w:pPr>
             <w:r/>
             <w:r>
               <w:t>Tartós HTTP-válaszfolyam</w:t>
@@ -4858,6 +5195,10 @@
             <w:tcW w:type="dxa" w:w="2409"/>
           </w:tcPr>
           <w:p>
+            <w:pPr>
+              <w:pStyle w:val="Normalfigure-table"/>
+              <w:keepNext/>
+            </w:pPr>
             <w:r/>
             <w:r>
               <w:t>Hosszan futó művelet előrehaladása</w:t>
@@ -4866,11 +5207,17 @@
         </w:tc>
       </w:tr>
       <w:tr>
+        <w:trPr>
+          <w:cantSplit/>
+        </w:trPr>
         <w:tc>
           <w:tcPr>
             <w:tcW w:type="dxa" w:w="2409"/>
           </w:tcPr>
           <w:p>
+            <w:pPr>
+              <w:pStyle w:val="Normalfigure-table"/>
+            </w:pPr>
             <w:r/>
             <w:r>
               <w:t>MQTT</w:t>
@@ -4882,6 +5229,9 @@
             <w:tcW w:type="dxa" w:w="2409"/>
           </w:tcPr>
           <w:p>
+            <w:pPr>
+              <w:pStyle w:val="Normalfigure-table"/>
+            </w:pPr>
             <w:r/>
             <w:r>
               <w:t>Publikáló → bróker → feliratkozók</w:t>
@@ -4893,6 +5243,9 @@
             <w:tcW w:type="dxa" w:w="2409"/>
           </w:tcPr>
           <w:p>
+            <w:pPr>
+              <w:pStyle w:val="Normalfigure-table"/>
+            </w:pPr>
             <w:r/>
             <w:r>
               <w:t>Tartós, brókeren keresztül</w:t>
@@ -4904,6 +5257,9 @@
             <w:tcW w:type="dxa" w:w="2409"/>
           </w:tcPr>
           <w:p>
+            <w:pPr>
+              <w:pStyle w:val="Normalfigure-table"/>
+            </w:pPr>
             <w:r/>
             <w:r>
               <w:t>Szétcsatolt, aszinkron eseményközvetítés</w:t>
@@ -5144,6 +5500,7 @@
     <w:p>
       <w:pPr>
         <w:pStyle w:val="Caption"/>
+        <w:keepNext/>
       </w:pPr>
       <w:r>
         <w:t>4. táblázat: A SwarmCam kommunikációs csatornái és megválasztásuk indoklása</w:t>
@@ -5162,11 +5519,20 @@
         <w:gridCol w:w="2409"/>
       </w:tblGrid>
       <w:tr>
+        <w:trPr>
+          <w:cantSplit/>
+          <w:tblHeader/>
+        </w:trPr>
         <w:tc>
           <w:tcPr>
             <w:tcW w:type="dxa" w:w="2409"/>
-          </w:tcPr>
-          <w:p>
+            <w:shd w:val="clear" w:color="auto" w:fill="BFBFBF"/>
+          </w:tcPr>
+          <w:p>
+            <w:pPr>
+              <w:pStyle w:val="Normalfigure-table"/>
+              <w:keepNext/>
+            </w:pPr>
             <w:r>
               <w:rPr>
                 <w:b/>
@@ -5183,8 +5549,13 @@
         <w:tc>
           <w:tcPr>
             <w:tcW w:type="dxa" w:w="2409"/>
-          </w:tcPr>
-          <w:p>
+            <w:shd w:val="clear" w:color="auto" w:fill="BFBFBF"/>
+          </w:tcPr>
+          <w:p>
+            <w:pPr>
+              <w:pStyle w:val="Normalfigure-table"/>
+              <w:keepNext/>
+            </w:pPr>
             <w:r>
               <w:rPr>
                 <w:b/>
@@ -5201,8 +5572,13 @@
         <w:tc>
           <w:tcPr>
             <w:tcW w:type="dxa" w:w="2409"/>
-          </w:tcPr>
-          <w:p>
+            <w:shd w:val="clear" w:color="auto" w:fill="BFBFBF"/>
+          </w:tcPr>
+          <w:p>
+            <w:pPr>
+              <w:pStyle w:val="Normalfigure-table"/>
+              <w:keepNext/>
+            </w:pPr>
             <w:r>
               <w:rPr>
                 <w:b/>
@@ -5219,8 +5595,13 @@
         <w:tc>
           <w:tcPr>
             <w:tcW w:type="dxa" w:w="2409"/>
-          </w:tcPr>
-          <w:p>
+            <w:shd w:val="clear" w:color="auto" w:fill="BFBFBF"/>
+          </w:tcPr>
+          <w:p>
+            <w:pPr>
+              <w:pStyle w:val="Normalfigure-table"/>
+              <w:keepNext/>
+            </w:pPr>
             <w:r>
               <w:rPr>
                 <w:b/>
@@ -5236,11 +5617,18 @@
         </w:tc>
       </w:tr>
       <w:tr>
+        <w:trPr>
+          <w:cantSplit/>
+        </w:trPr>
         <w:tc>
           <w:tcPr>
             <w:tcW w:type="dxa" w:w="2409"/>
           </w:tcPr>
           <w:p>
+            <w:pPr>
+              <w:pStyle w:val="Normalfigure-table"/>
+              <w:keepNext/>
+            </w:pPr>
             <w:r/>
             <w:r>
               <w:t>REST / HTTP</w:t>
@@ -5252,6 +5640,10 @@
             <w:tcW w:type="dxa" w:w="2409"/>
           </w:tcPr>
           <w:p>
+            <w:pPr>
+              <w:pStyle w:val="Normalfigure-table"/>
+              <w:keepNext/>
+            </w:pPr>
             <w:r/>
             <w:r>
               <w:t>Frontend ↔ backend, backend ↔ Frigate</w:t>
@@ -5263,6 +5655,10 @@
             <w:tcW w:type="dxa" w:w="2409"/>
           </w:tcPr>
           <w:p>
+            <w:pPr>
+              <w:pStyle w:val="Normalfigure-table"/>
+              <w:keepNext/>
+            </w:pPr>
             <w:r/>
             <w:r>
               <w:t>Kameralista, események, felvételek, felhasználók, konfiguráció</w:t>
@@ -5274,6 +5670,10 @@
             <w:tcW w:type="dxa" w:w="2409"/>
           </w:tcPr>
           <w:p>
+            <w:pPr>
+              <w:pStyle w:val="Normalfigure-table"/>
+              <w:keepNext/>
+            </w:pPr>
             <w:r/>
             <w:r>
               <w:t>Szinkron, állapotmentes erőforrás-hozzáférés; a kliens tudja, mikor van szüksége az adatra</w:t>
@@ -5282,11 +5682,18 @@
         </w:tc>
       </w:tr>
       <w:tr>
+        <w:trPr>
+          <w:cantSplit/>
+        </w:trPr>
         <w:tc>
           <w:tcPr>
             <w:tcW w:type="dxa" w:w="2409"/>
           </w:tcPr>
           <w:p>
+            <w:pPr>
+              <w:pStyle w:val="Normalfigure-table"/>
+              <w:keepNext/>
+            </w:pPr>
             <w:r/>
             <w:r>
               <w:t>WebSocket</w:t>
@@ -5298,6 +5705,10 @@
             <w:tcW w:type="dxa" w:w="2409"/>
           </w:tcPr>
           <w:p>
+            <w:pPr>
+              <w:pStyle w:val="Normalfigure-table"/>
+              <w:keepNext/>
+            </w:pPr>
             <w:r/>
             <w:r>
               <w:t>Backend → frontend</w:t>
@@ -5309,6 +5720,10 @@
             <w:tcW w:type="dxa" w:w="2409"/>
           </w:tcPr>
           <w:p>
+            <w:pPr>
+              <w:pStyle w:val="Normalfigure-table"/>
+              <w:keepNext/>
+            </w:pPr>
             <w:r/>
             <w:r>
               <w:t>Kamerastátusz, detektált események, riasztások</w:t>
@@ -5320,6 +5735,10 @@
             <w:tcW w:type="dxa" w:w="2409"/>
           </w:tcPr>
           <w:p>
+            <w:pPr>
+              <w:pStyle w:val="Normalfigure-table"/>
+              <w:keepNext/>
+            </w:pPr>
             <w:r/>
             <w:r>
               <w:t>A szerver kezdeményezi a frissítést; egyetlen tartós kapcsolat minden eseménytípusra</w:t>
@@ -5328,11 +5747,18 @@
         </w:tc>
       </w:tr>
       <w:tr>
+        <w:trPr>
+          <w:cantSplit/>
+        </w:trPr>
         <w:tc>
           <w:tcPr>
             <w:tcW w:type="dxa" w:w="2409"/>
           </w:tcPr>
           <w:p>
+            <w:pPr>
+              <w:pStyle w:val="Normalfigure-table"/>
+              <w:keepNext/>
+            </w:pPr>
             <w:r/>
             <w:r>
               <w:t>WebSocket (bináris)</w:t>
@@ -5344,6 +5770,10 @@
             <w:tcW w:type="dxa" w:w="2409"/>
           </w:tcPr>
           <w:p>
+            <w:pPr>
+              <w:pStyle w:val="Normalfigure-table"/>
+              <w:keepNext/>
+            </w:pPr>
             <w:r/>
             <w:r>
               <w:t>go2rtc → backend → böngésző</w:t>
@@ -5355,6 +5785,10 @@
             <w:tcW w:type="dxa" w:w="2409"/>
           </w:tcPr>
           <w:p>
+            <w:pPr>
+              <w:pStyle w:val="Normalfigure-table"/>
+              <w:keepNext/>
+            </w:pPr>
             <w:r/>
             <w:r>
               <w:t>fMP4 videószegmensek (élőkép)</w:t>
@@ -5366,6 +5800,10 @@
             <w:tcW w:type="dxa" w:w="2409"/>
           </w:tcPr>
           <w:p>
+            <w:pPr>
+              <w:pStyle w:val="Normalfigure-table"/>
+              <w:keepNext/>
+            </w:pPr>
             <w:r/>
             <w:r>
               <w:t>A meglévő nginx- és hitelesítési útvonalon halad; nincs szükség ICE-tárgyalásra és UDP-portra</w:t>
@@ -5374,11 +5812,18 @@
         </w:tc>
       </w:tr>
       <w:tr>
+        <w:trPr>
+          <w:cantSplit/>
+        </w:trPr>
         <w:tc>
           <w:tcPr>
             <w:tcW w:type="dxa" w:w="2409"/>
           </w:tcPr>
           <w:p>
+            <w:pPr>
+              <w:pStyle w:val="Normalfigure-table"/>
+              <w:keepNext/>
+            </w:pPr>
             <w:r/>
             <w:r>
               <w:t>SSE</w:t>
@@ -5390,6 +5835,10 @@
             <w:tcW w:type="dxa" w:w="2409"/>
           </w:tcPr>
           <w:p>
+            <w:pPr>
+              <w:pStyle w:val="Normalfigure-table"/>
+              <w:keepNext/>
+            </w:pPr>
             <w:r/>
             <w:r>
               <w:t>Backend → frontend</w:t>
@@ -5401,6 +5850,10 @@
             <w:tcW w:type="dxa" w:w="2409"/>
           </w:tcPr>
           <w:p>
+            <w:pPr>
+              <w:pStyle w:val="Normalfigure-table"/>
+              <w:keepNext/>
+            </w:pPr>
             <w:r/>
             <w:r>
               <w:t>A hálózati felderítés élő naplója</w:t>
@@ -5412,6 +5865,10 @@
             <w:tcW w:type="dxa" w:w="2409"/>
           </w:tcPr>
           <w:p>
+            <w:pPr>
+              <w:pStyle w:val="Normalfigure-table"/>
+              <w:keepNext/>
+            </w:pPr>
             <w:r/>
             <w:r>
               <w:t>Egyirányú, hosszan futó folyamat előrehaladása; közönséges HTTP-válasz, minden proxyn átmegy</w:t>
@@ -5420,11 +5877,17 @@
         </w:tc>
       </w:tr>
       <w:tr>
+        <w:trPr>
+          <w:cantSplit/>
+        </w:trPr>
         <w:tc>
           <w:tcPr>
             <w:tcW w:type="dxa" w:w="2409"/>
           </w:tcPr>
           <w:p>
+            <w:pPr>
+              <w:pStyle w:val="Normalfigure-table"/>
+            </w:pPr>
             <w:r/>
             <w:r>
               <w:t>MQTT</w:t>
@@ -5436,6 +5899,9 @@
             <w:tcW w:type="dxa" w:w="2409"/>
           </w:tcPr>
           <w:p>
+            <w:pPr>
+              <w:pStyle w:val="Normalfigure-table"/>
+            </w:pPr>
             <w:r/>
             <w:r>
               <w:t>Frigate és fire-detector → bróker → backend</w:t>
@@ -5447,6 +5913,9 @@
             <w:tcW w:type="dxa" w:w="2409"/>
           </w:tcPr>
           <w:p>
+            <w:pPr>
+              <w:pStyle w:val="Normalfigure-table"/>
+            </w:pPr>
             <w:r/>
             <w:r>
               <w:t>Objektumdetekciós és tűz-/füstesemények</w:t>
@@ -5458,6 +5927,9 @@
             <w:tcW w:type="dxa" w:w="2409"/>
           </w:tcPr>
           <w:p>
+            <w:pPr>
+              <w:pStyle w:val="Normalfigure-table"/>
+            </w:pPr>
             <w:r/>
             <w:r>
               <w:t>Két, egymást nem ismerő forrás szétcsatolt közvetítése; a bróker átmeneti backend-kiesést is túlél</w:t>
@@ -5553,6 +6025,7 @@
     <w:p>
       <w:pPr>
         <w:pStyle w:val="Caption"/>
+        <w:keepNext/>
       </w:pPr>
       <w:r>
         <w:t>5. táblázat: A SwarmCam Docker-konténerei</w:t>
@@ -5571,11 +6044,20 @@
         <w:gridCol w:w="2409"/>
       </w:tblGrid>
       <w:tr>
+        <w:trPr>
+          <w:cantSplit/>
+          <w:tblHeader/>
+        </w:trPr>
         <w:tc>
           <w:tcPr>
             <w:tcW w:type="dxa" w:w="2409"/>
-          </w:tcPr>
-          <w:p>
+            <w:shd w:val="clear" w:color="auto" w:fill="BFBFBF"/>
+          </w:tcPr>
+          <w:p>
+            <w:pPr>
+              <w:pStyle w:val="Normalfigure-table"/>
+              <w:keepNext/>
+            </w:pPr>
             <w:r>
               <w:rPr>
                 <w:b/>
@@ -5592,8 +6074,13 @@
         <w:tc>
           <w:tcPr>
             <w:tcW w:type="dxa" w:w="2409"/>
-          </w:tcPr>
-          <w:p>
+            <w:shd w:val="clear" w:color="auto" w:fill="BFBFBF"/>
+          </w:tcPr>
+          <w:p>
+            <w:pPr>
+              <w:pStyle w:val="Normalfigure-table"/>
+              <w:keepNext/>
+            </w:pPr>
             <w:r>
               <w:rPr>
                 <w:b/>
@@ -5610,8 +6097,13 @@
         <w:tc>
           <w:tcPr>
             <w:tcW w:type="dxa" w:w="2409"/>
-          </w:tcPr>
-          <w:p>
+            <w:shd w:val="clear" w:color="auto" w:fill="BFBFBF"/>
+          </w:tcPr>
+          <w:p>
+            <w:pPr>
+              <w:pStyle w:val="Normalfigure-table"/>
+              <w:keepNext/>
+            </w:pPr>
             <w:r>
               <w:rPr>
                 <w:b/>
@@ -5628,8 +6120,13 @@
         <w:tc>
           <w:tcPr>
             <w:tcW w:type="dxa" w:w="2409"/>
-          </w:tcPr>
-          <w:p>
+            <w:shd w:val="clear" w:color="auto" w:fill="BFBFBF"/>
+          </w:tcPr>
+          <w:p>
+            <w:pPr>
+              <w:pStyle w:val="Normalfigure-table"/>
+              <w:keepNext/>
+            </w:pPr>
             <w:r>
               <w:rPr>
                 <w:b/>
@@ -5645,11 +6142,18 @@
         </w:tc>
       </w:tr>
       <w:tr>
+        <w:trPr>
+          <w:cantSplit/>
+        </w:trPr>
         <w:tc>
           <w:tcPr>
             <w:tcW w:type="dxa" w:w="2409"/>
           </w:tcPr>
           <w:p>
+            <w:pPr>
+              <w:pStyle w:val="Normalfigure-table"/>
+              <w:keepNext/>
+            </w:pPr>
             <w:r/>
             <w:r>
               <w:t>frigate</w:t>
@@ -5661,6 +6165,10 @@
             <w:tcW w:type="dxa" w:w="2409"/>
           </w:tcPr>
           <w:p>
+            <w:pPr>
+              <w:pStyle w:val="Normalfigure-table"/>
+              <w:keepNext/>
+            </w:pPr>
             <w:r/>
             <w:r>
               <w:t>ghcr.io/blakeblackshear/frigate:stable-tensorrt</w:t>
@@ -5672,6 +6180,10 @@
             <w:tcW w:type="dxa" w:w="2409"/>
           </w:tcPr>
           <w:p>
+            <w:pPr>
+              <w:pStyle w:val="Normalfigure-table"/>
+              <w:keepNext/>
+            </w:pPr>
             <w:r/>
             <w:r>
               <w:t>host, NVIDIA runtime</w:t>
@@ -5683,6 +6195,10 @@
             <w:tcW w:type="dxa" w:w="2409"/>
           </w:tcPr>
           <w:p>
+            <w:pPr>
+              <w:pStyle w:val="Normalfigure-table"/>
+              <w:keepNext/>
+            </w:pPr>
             <w:r/>
             <w:r>
               <w:t>AI-alapú NVR, go2rtc restream, felvételkezelés</w:t>
@@ -5691,11 +6207,18 @@
         </w:tc>
       </w:tr>
       <w:tr>
+        <w:trPr>
+          <w:cantSplit/>
+        </w:trPr>
         <w:tc>
           <w:tcPr>
             <w:tcW w:type="dxa" w:w="2409"/>
           </w:tcPr>
           <w:p>
+            <w:pPr>
+              <w:pStyle w:val="Normalfigure-table"/>
+              <w:keepNext/>
+            </w:pPr>
             <w:r/>
             <w:r>
               <w:t>mosquitto</w:t>
@@ -5707,6 +6230,10 @@
             <w:tcW w:type="dxa" w:w="2409"/>
           </w:tcPr>
           <w:p>
+            <w:pPr>
+              <w:pStyle w:val="Normalfigure-table"/>
+              <w:keepNext/>
+            </w:pPr>
             <w:r/>
             <w:r>
               <w:t>eclipse-mosquitto:2</w:t>
@@ -5718,6 +6245,10 @@
             <w:tcW w:type="dxa" w:w="2409"/>
           </w:tcPr>
           <w:p>
+            <w:pPr>
+              <w:pStyle w:val="Normalfigure-table"/>
+              <w:keepNext/>
+            </w:pPr>
             <w:r/>
             <w:r>
               <w:t>bridge (swarmcam)</w:t>
@@ -5729,6 +6260,10 @@
             <w:tcW w:type="dxa" w:w="2409"/>
           </w:tcPr>
           <w:p>
+            <w:pPr>
+              <w:pStyle w:val="Normalfigure-table"/>
+              <w:keepNext/>
+            </w:pPr>
             <w:r/>
             <w:r>
               <w:t>MQTT üzenetbróker</w:t>
@@ -5737,11 +6272,18 @@
         </w:tc>
       </w:tr>
       <w:tr>
+        <w:trPr>
+          <w:cantSplit/>
+        </w:trPr>
         <w:tc>
           <w:tcPr>
             <w:tcW w:type="dxa" w:w="2409"/>
           </w:tcPr>
           <w:p>
+            <w:pPr>
+              <w:pStyle w:val="Normalfigure-table"/>
+              <w:keepNext/>
+            </w:pPr>
             <w:r/>
             <w:r>
               <w:t>swarmcam-backend</w:t>
@@ -5753,6 +6295,10 @@
             <w:tcW w:type="dxa" w:w="2409"/>
           </w:tcPr>
           <w:p>
+            <w:pPr>
+              <w:pStyle w:val="Normalfigure-table"/>
+              <w:keepNext/>
+            </w:pPr>
             <w:r/>
             <w:r>
               <w:t>saját build (FastAPI)</w:t>
@@ -5764,6 +6310,10 @@
             <w:tcW w:type="dxa" w:w="2409"/>
           </w:tcPr>
           <w:p>
+            <w:pPr>
+              <w:pStyle w:val="Normalfigure-table"/>
+              <w:keepNext/>
+            </w:pPr>
             <w:r/>
             <w:r>
               <w:t>host</w:t>
@@ -5775,6 +6325,10 @@
             <w:tcW w:type="dxa" w:w="2409"/>
           </w:tcPr>
           <w:p>
+            <w:pPr>
+              <w:pStyle w:val="Normalfigure-table"/>
+              <w:keepNext/>
+            </w:pPr>
             <w:r/>
             <w:r>
               <w:t>REST/WebSocket API, felderítés, állapotfigyelés</w:t>
@@ -5783,11 +6337,18 @@
         </w:tc>
       </w:tr>
       <w:tr>
+        <w:trPr>
+          <w:cantSplit/>
+        </w:trPr>
         <w:tc>
           <w:tcPr>
             <w:tcW w:type="dxa" w:w="2409"/>
           </w:tcPr>
           <w:p>
+            <w:pPr>
+              <w:pStyle w:val="Normalfigure-table"/>
+              <w:keepNext/>
+            </w:pPr>
             <w:r/>
             <w:r>
               <w:t>swarmcam-dashboard</w:t>
@@ -5799,6 +6360,10 @@
             <w:tcW w:type="dxa" w:w="2409"/>
           </w:tcPr>
           <w:p>
+            <w:pPr>
+              <w:pStyle w:val="Normalfigure-table"/>
+              <w:keepNext/>
+            </w:pPr>
             <w:r/>
             <w:r>
               <w:t>saját build (nginx + React)</w:t>
@@ -5810,6 +6375,10 @@
             <w:tcW w:type="dxa" w:w="2409"/>
           </w:tcPr>
           <w:p>
+            <w:pPr>
+              <w:pStyle w:val="Normalfigure-table"/>
+              <w:keepNext/>
+            </w:pPr>
             <w:r/>
             <w:r>
               <w:t>host</w:t>
@@ -5821,6 +6390,10 @@
             <w:tcW w:type="dxa" w:w="2409"/>
           </w:tcPr>
           <w:p>
+            <w:pPr>
+              <w:pStyle w:val="Normalfigure-table"/>
+              <w:keepNext/>
+            </w:pPr>
             <w:r/>
             <w:r>
               <w:t>A statikus frontend kiszolgálása, fordított proxy</w:t>
@@ -5829,11 +6402,17 @@
         </w:tc>
       </w:tr>
       <w:tr>
+        <w:trPr>
+          <w:cantSplit/>
+        </w:trPr>
         <w:tc>
           <w:tcPr>
             <w:tcW w:type="dxa" w:w="2409"/>
           </w:tcPr>
           <w:p>
+            <w:pPr>
+              <w:pStyle w:val="Normalfigure-table"/>
+            </w:pPr>
             <w:r/>
             <w:r>
               <w:t>swarmcam-fire-detector</w:t>
@@ -5845,6 +6424,9 @@
             <w:tcW w:type="dxa" w:w="2409"/>
           </w:tcPr>
           <w:p>
+            <w:pPr>
+              <w:pStyle w:val="Normalfigure-table"/>
+            </w:pPr>
             <w:r/>
             <w:r>
               <w:t>saját build (YOLO + paho-mqtt)</w:t>
@@ -5856,6 +6438,9 @@
             <w:tcW w:type="dxa" w:w="2409"/>
           </w:tcPr>
           <w:p>
+            <w:pPr>
+              <w:pStyle w:val="Normalfigure-table"/>
+            </w:pPr>
             <w:r/>
             <w:r>
               <w:t>host, NVIDIA runtime</w:t>
@@ -5867,6 +6452,9 @@
             <w:tcW w:type="dxa" w:w="2409"/>
           </w:tcPr>
           <w:p>
+            <w:pPr>
+              <w:pStyle w:val="Normalfigure-table"/>
+            </w:pPr>
             <w:r/>
             <w:r>
               <w:t>Tűz- és füstdetekció</w:t>
@@ -6177,6 +6765,7 @@
     <w:p>
       <w:pPr>
         <w:pStyle w:val="Caption"/>
+        <w:keepNext/>
       </w:pPr>
       <w:r>
         <w:t>6. táblázat: A kamera-protokoll leképezése az alkalmazáscsere során</w:t>
@@ -6194,11 +6783,20 @@
         <w:gridCol w:w="3212"/>
       </w:tblGrid>
       <w:tr>
+        <w:trPr>
+          <w:cantSplit/>
+          <w:tblHeader/>
+        </w:trPr>
         <w:tc>
           <w:tcPr>
             <w:tcW w:type="dxa" w:w="3212"/>
-          </w:tcPr>
-          <w:p>
+            <w:shd w:val="clear" w:color="auto" w:fill="BFBFBF"/>
+          </w:tcPr>
+          <w:p>
+            <w:pPr>
+              <w:pStyle w:val="Normalfigure-table"/>
+              <w:keepNext/>
+            </w:pPr>
             <w:r>
               <w:rPr>
                 <w:b/>
@@ -6215,8 +6813,13 @@
         <w:tc>
           <w:tcPr>
             <w:tcW w:type="dxa" w:w="3212"/>
-          </w:tcPr>
-          <w:p>
+            <w:shd w:val="clear" w:color="auto" w:fill="BFBFBF"/>
+          </w:tcPr>
+          <w:p>
+            <w:pPr>
+              <w:pStyle w:val="Normalfigure-table"/>
+              <w:keepNext/>
+            </w:pPr>
             <w:r>
               <w:rPr>
                 <w:b/>
@@ -6233,8 +6836,13 @@
         <w:tc>
           <w:tcPr>
             <w:tcW w:type="dxa" w:w="3212"/>
-          </w:tcPr>
-          <w:p>
+            <w:shd w:val="clear" w:color="auto" w:fill="BFBFBF"/>
+          </w:tcPr>
+          <w:p>
+            <w:pPr>
+              <w:pStyle w:val="Normalfigure-table"/>
+              <w:keepNext/>
+            </w:pPr>
             <w:r>
               <w:rPr>
                 <w:b/>
@@ -6250,11 +6858,18 @@
         </w:tc>
       </w:tr>
       <w:tr>
+        <w:trPr>
+          <w:cantSplit/>
+        </w:trPr>
         <w:tc>
           <w:tcPr>
             <w:tcW w:type="dxa" w:w="3212"/>
           </w:tcPr>
           <w:p>
+            <w:pPr>
+              <w:pStyle w:val="Normalfigure-table"/>
+              <w:keepNext/>
+            </w:pPr>
             <w:r/>
             <w:r>
               <w:t>Alapértelmezett port</w:t>
@@ -6266,6 +6881,10 @@
             <w:tcW w:type="dxa" w:w="3212"/>
           </w:tcPr>
           <w:p>
+            <w:pPr>
+              <w:pStyle w:val="Normalfigure-table"/>
+              <w:keepNext/>
+            </w:pPr>
             <w:r/>
             <w:r>
               <w:t>8080 (HTTP)</w:t>
@@ -6277,6 +6896,10 @@
             <w:tcW w:type="dxa" w:w="3212"/>
           </w:tcPr>
           <w:p>
+            <w:pPr>
+              <w:pStyle w:val="Normalfigure-table"/>
+              <w:keepNext/>
+            </w:pPr>
             <w:r/>
             <w:r>
               <w:t>4444 (HTTPS, önaláírt tanúsítvány)</w:t>
@@ -6285,11 +6908,18 @@
         </w:tc>
       </w:tr>
       <w:tr>
+        <w:trPr>
+          <w:cantSplit/>
+        </w:trPr>
         <w:tc>
           <w:tcPr>
             <w:tcW w:type="dxa" w:w="3212"/>
           </w:tcPr>
           <w:p>
+            <w:pPr>
+              <w:pStyle w:val="Normalfigure-table"/>
+              <w:keepNext/>
+            </w:pPr>
             <w:r/>
             <w:r>
               <w:t>Ujjlenyomat</w:t>
@@ -6301,6 +6931,10 @@
             <w:tcW w:type="dxa" w:w="3212"/>
           </w:tcPr>
           <w:p>
+            <w:pPr>
+              <w:pStyle w:val="Normalfigure-table"/>
+              <w:keepNext/>
+            </w:pPr>
             <w:r/>
             <w:r>
               <w:t>/status.json, „curvals" kulcs</w:t>
@@ -6312,6 +6946,10 @@
             <w:tcW w:type="dxa" w:w="3212"/>
           </w:tcPr>
           <w:p>
+            <w:pPr>
+              <w:pStyle w:val="Normalfigure-table"/>
+              <w:keepNext/>
+            </w:pPr>
             <w:r/>
             <w:r>
               <w:t>/info.json, „cameras" + „settings" kulcs</w:t>
@@ -6320,11 +6958,18 @@
         </w:tc>
       </w:tr>
       <w:tr>
+        <w:trPr>
+          <w:cantSplit/>
+        </w:trPr>
         <w:tc>
           <w:tcPr>
             <w:tcW w:type="dxa" w:w="3212"/>
           </w:tcPr>
           <w:p>
+            <w:pPr>
+              <w:pStyle w:val="Normalfigure-table"/>
+              <w:keepNext/>
+            </w:pPr>
             <w:r/>
             <w:r>
               <w:t>MJPEG élőkép</w:t>
@@ -6336,6 +6981,10 @@
             <w:tcW w:type="dxa" w:w="3212"/>
           </w:tcPr>
           <w:p>
+            <w:pPr>
+              <w:pStyle w:val="Normalfigure-table"/>
+              <w:keepNext/>
+            </w:pPr>
             <w:r/>
             <w:r>
               <w:t>/videofeed</w:t>
@@ -6347,6 +6996,10 @@
             <w:tcW w:type="dxa" w:w="3212"/>
           </w:tcPr>
           <w:p>
+            <w:pPr>
+              <w:pStyle w:val="Normalfigure-table"/>
+              <w:keepNext/>
+            </w:pPr>
             <w:r/>
             <w:r>
               <w:t>/video/mjpeg</w:t>
@@ -6355,11 +7008,18 @@
         </w:tc>
       </w:tr>
       <w:tr>
+        <w:trPr>
+          <w:cantSplit/>
+        </w:trPr>
         <w:tc>
           <w:tcPr>
             <w:tcW w:type="dxa" w:w="3212"/>
           </w:tcPr>
           <w:p>
+            <w:pPr>
+              <w:pStyle w:val="Normalfigure-table"/>
+              <w:keepNext/>
+            </w:pPr>
             <w:r/>
             <w:r>
               <w:t>Videóforrás a rögzítéshez</w:t>
@@ -6371,6 +7031,10 @@
             <w:tcW w:type="dxa" w:w="3212"/>
           </w:tcPr>
           <w:p>
+            <w:pPr>
+              <w:pStyle w:val="Normalfigure-table"/>
+              <w:keepNext/>
+            </w:pPr>
             <w:r/>
             <w:r>
               <w:t>Közvetlen RTSP-végpont</w:t>
@@ -6382,6 +7046,10 @@
             <w:tcW w:type="dxa" w:w="3212"/>
           </w:tcPr>
           <w:p>
+            <w:pPr>
+              <w:pStyle w:val="Normalfigure-table"/>
+              <w:keepNext/>
+            </w:pPr>
             <w:r/>
             <w:r>
               <w:t>/video/h264 nyers folyam, go2rtc újracsomagolással</w:t>
@@ -6390,11 +7058,18 @@
         </w:tc>
       </w:tr>
       <w:tr>
+        <w:trPr>
+          <w:cantSplit/>
+        </w:trPr>
         <w:tc>
           <w:tcPr>
             <w:tcW w:type="dxa" w:w="3212"/>
           </w:tcPr>
           <w:p>
+            <w:pPr>
+              <w:pStyle w:val="Normalfigure-table"/>
+              <w:keepNext/>
+            </w:pPr>
             <w:r/>
             <w:r>
               <w:t>Zseblámpa</w:t>
@@ -6406,6 +7081,10 @@
             <w:tcW w:type="dxa" w:w="3212"/>
           </w:tcPr>
           <w:p>
+            <w:pPr>
+              <w:pStyle w:val="Normalfigure-table"/>
+              <w:keepNext/>
+            </w:pPr>
             <w:r/>
             <w:r>
               <w:t>/enabletorch, /disabletorch</w:t>
@@ -6417,6 +7096,10 @@
             <w:tcW w:type="dxa" w:w="3212"/>
           </w:tcPr>
           <w:p>
+            <w:pPr>
+              <w:pStyle w:val="Normalfigure-table"/>
+              <w:keepNext/>
+            </w:pPr>
             <w:r/>
             <w:r>
               <w:t>/?torch=on / /?torch=off</w:t>
@@ -6425,11 +7108,18 @@
         </w:tc>
       </w:tr>
       <w:tr>
+        <w:trPr>
+          <w:cantSplit/>
+        </w:trPr>
         <w:tc>
           <w:tcPr>
             <w:tcW w:type="dxa" w:w="3212"/>
           </w:tcPr>
           <w:p>
+            <w:pPr>
+              <w:pStyle w:val="Normalfigure-table"/>
+              <w:keepNext/>
+            </w:pPr>
             <w:r/>
             <w:r>
               <w:t>Beállításírás</w:t>
@@ -6441,6 +7131,10 @@
             <w:tcW w:type="dxa" w:w="3212"/>
           </w:tcPr>
           <w:p>
+            <w:pPr>
+              <w:pStyle w:val="Normalfigure-table"/>
+              <w:keepNext/>
+            </w:pPr>
             <w:r/>
             <w:r>
               <w:t>Kulcsonként külön kérés</w:t>
@@ -6452,6 +7146,10 @@
             <w:tcW w:type="dxa" w:w="3212"/>
           </w:tcPr>
           <w:p>
+            <w:pPr>
+              <w:pStyle w:val="Normalfigure-table"/>
+              <w:keepNext/>
+            </w:pPr>
             <w:r/>
             <w:r>
               <w:t>Egyetlen kérés több paraméterrel</w:t>
@@ -6460,11 +7158,17 @@
         </w:tc>
       </w:tr>
       <w:tr>
+        <w:trPr>
+          <w:cantSplit/>
+        </w:trPr>
         <w:tc>
           <w:tcPr>
             <w:tcW w:type="dxa" w:w="3212"/>
           </w:tcPr>
           <w:p>
+            <w:pPr>
+              <w:pStyle w:val="Normalfigure-table"/>
+            </w:pPr>
             <w:r/>
             <w:r>
               <w:t>Licenc és terjesztés</w:t>
@@ -6476,6 +7180,9 @@
             <w:tcW w:type="dxa" w:w="3212"/>
           </w:tcPr>
           <w:p>
+            <w:pPr>
+              <w:pStyle w:val="Normalfigure-table"/>
+            </w:pPr>
             <w:r/>
             <w:r>
               <w:t>Zárt forrás, csak Play áruház</w:t>
@@ -6487,6 +7194,9 @@
             <w:tcW w:type="dxa" w:w="3212"/>
           </w:tcPr>
           <w:p>
+            <w:pPr>
+              <w:pStyle w:val="Normalfigure-table"/>
+            </w:pPr>
             <w:r/>
             <w:r>
               <w:t>MIT, F-Droid és forráskód</w:t>
@@ -8263,6 +8973,7 @@
     <w:p>
       <w:pPr>
         <w:pStyle w:val="Caption"/>
+        <w:keepNext/>
       </w:pPr>
       <w:r>
         <w:t>7. táblázat: A mérési környezet</w:t>
@@ -8279,11 +8990,20 @@
         <w:gridCol w:w="4818"/>
       </w:tblGrid>
       <w:tr>
+        <w:trPr>
+          <w:cantSplit/>
+          <w:tblHeader/>
+        </w:trPr>
         <w:tc>
           <w:tcPr>
             <w:tcW w:type="dxa" w:w="4818"/>
-          </w:tcPr>
-          <w:p>
+            <w:shd w:val="clear" w:color="auto" w:fill="BFBFBF"/>
+          </w:tcPr>
+          <w:p>
+            <w:pPr>
+              <w:pStyle w:val="Normalfigure-table"/>
+              <w:keepNext/>
+            </w:pPr>
             <w:r>
               <w:rPr>
                 <w:b/>
@@ -8300,8 +9020,13 @@
         <w:tc>
           <w:tcPr>
             <w:tcW w:type="dxa" w:w="4818"/>
-          </w:tcPr>
-          <w:p>
+            <w:shd w:val="clear" w:color="auto" w:fill="BFBFBF"/>
+          </w:tcPr>
+          <w:p>
+            <w:pPr>
+              <w:pStyle w:val="Normalfigure-table"/>
+              <w:keepNext/>
+            </w:pPr>
             <w:r>
               <w:rPr>
                 <w:b/>
@@ -8317,11 +9042,18 @@
         </w:tc>
       </w:tr>
       <w:tr>
+        <w:trPr>
+          <w:cantSplit/>
+        </w:trPr>
         <w:tc>
           <w:tcPr>
             <w:tcW w:type="dxa" w:w="4818"/>
           </w:tcPr>
           <w:p>
+            <w:pPr>
+              <w:pStyle w:val="Normalfigure-table"/>
+              <w:keepNext/>
+            </w:pPr>
             <w:r/>
             <w:r>
               <w:t>Gép</w:t>
@@ -8333,6 +9065,10 @@
             <w:tcW w:type="dxa" w:w="4818"/>
           </w:tcPr>
           <w:p>
+            <w:pPr>
+              <w:pStyle w:val="Normalfigure-table"/>
+              <w:keepNext/>
+            </w:pPr>
             <w:r/>
             <w:r>
               <w:t>ASUS ROG Strix G513QM hordozható munkaállomás</w:t>
@@ -8341,11 +9077,18 @@
         </w:tc>
       </w:tr>
       <w:tr>
+        <w:trPr>
+          <w:cantSplit/>
+        </w:trPr>
         <w:tc>
           <w:tcPr>
             <w:tcW w:type="dxa" w:w="4818"/>
           </w:tcPr>
           <w:p>
+            <w:pPr>
+              <w:pStyle w:val="Normalfigure-table"/>
+              <w:keepNext/>
+            </w:pPr>
             <w:r/>
             <w:r>
               <w:t>Processzor</w:t>
@@ -8357,6 +9100,10 @@
             <w:tcW w:type="dxa" w:w="4818"/>
           </w:tcPr>
           <w:p>
+            <w:pPr>
+              <w:pStyle w:val="Normalfigure-table"/>
+              <w:keepNext/>
+            </w:pPr>
             <w:r/>
             <w:r>
               <w:t>AMD Ryzen 9 5900HX, 8 mag / 16 szál</w:t>
@@ -8365,11 +9112,18 @@
         </w:tc>
       </w:tr>
       <w:tr>
+        <w:trPr>
+          <w:cantSplit/>
+        </w:trPr>
         <w:tc>
           <w:tcPr>
             <w:tcW w:type="dxa" w:w="4818"/>
           </w:tcPr>
           <w:p>
+            <w:pPr>
+              <w:pStyle w:val="Normalfigure-table"/>
+              <w:keepNext/>
+            </w:pPr>
             <w:r/>
             <w:r>
               <w:t>Memória</w:t>
@@ -8381,6 +9135,10 @@
             <w:tcW w:type="dxa" w:w="4818"/>
           </w:tcPr>
           <w:p>
+            <w:pPr>
+              <w:pStyle w:val="Normalfigure-table"/>
+              <w:keepNext/>
+            </w:pPr>
             <w:r/>
             <w:r>
               <w:t>15 GiB</w:t>
@@ -8389,11 +9147,18 @@
         </w:tc>
       </w:tr>
       <w:tr>
+        <w:trPr>
+          <w:cantSplit/>
+        </w:trPr>
         <w:tc>
           <w:tcPr>
             <w:tcW w:type="dxa" w:w="4818"/>
           </w:tcPr>
           <w:p>
+            <w:pPr>
+              <w:pStyle w:val="Normalfigure-table"/>
+              <w:keepNext/>
+            </w:pPr>
             <w:r/>
             <w:r>
               <w:t>GPU</w:t>
@@ -8405,6 +9170,10 @@
             <w:tcW w:type="dxa" w:w="4818"/>
           </w:tcPr>
           <w:p>
+            <w:pPr>
+              <w:pStyle w:val="Normalfigure-table"/>
+              <w:keepNext/>
+            </w:pPr>
             <w:r/>
             <w:r>
               <w:t>NVIDIA GeForce RTX 3060 Laptop, 6 GiB, 595.84 illesztőprogram</w:t>
@@ -8413,11 +9182,18 @@
         </w:tc>
       </w:tr>
       <w:tr>
+        <w:trPr>
+          <w:cantSplit/>
+        </w:trPr>
         <w:tc>
           <w:tcPr>
             <w:tcW w:type="dxa" w:w="4818"/>
           </w:tcPr>
           <w:p>
+            <w:pPr>
+              <w:pStyle w:val="Normalfigure-table"/>
+              <w:keepNext/>
+            </w:pPr>
             <w:r/>
             <w:r>
               <w:t>Operációs rendszer</w:t>
@@ -8429,6 +9205,10 @@
             <w:tcW w:type="dxa" w:w="4818"/>
           </w:tcPr>
           <w:p>
+            <w:pPr>
+              <w:pStyle w:val="Normalfigure-table"/>
+              <w:keepNext/>
+            </w:pPr>
             <w:r/>
             <w:r>
               <w:t>Ubuntu 24.04.3 LTS</w:t>
@@ -8437,11 +9217,18 @@
         </w:tc>
       </w:tr>
       <w:tr>
+        <w:trPr>
+          <w:cantSplit/>
+        </w:trPr>
         <w:tc>
           <w:tcPr>
             <w:tcW w:type="dxa" w:w="4818"/>
           </w:tcPr>
           <w:p>
+            <w:pPr>
+              <w:pStyle w:val="Normalfigure-table"/>
+              <w:keepNext/>
+            </w:pPr>
             <w:r/>
             <w:r>
               <w:t>Konténerkörnyezet</w:t>
@@ -8453,6 +9240,10 @@
             <w:tcW w:type="dxa" w:w="4818"/>
           </w:tcPr>
           <w:p>
+            <w:pPr>
+              <w:pStyle w:val="Normalfigure-table"/>
+              <w:keepNext/>
+            </w:pPr>
             <w:r/>
             <w:r>
               <w:t>Docker 28.5.2, Docker Compose v2</w:t>
@@ -8461,11 +9252,18 @@
         </w:tc>
       </w:tr>
       <w:tr>
+        <w:trPr>
+          <w:cantSplit/>
+        </w:trPr>
         <w:tc>
           <w:tcPr>
             <w:tcW w:type="dxa" w:w="4818"/>
           </w:tcPr>
           <w:p>
+            <w:pPr>
+              <w:pStyle w:val="Normalfigure-table"/>
+              <w:keepNext/>
+            </w:pPr>
             <w:r/>
             <w:r>
               <w:t>Frigate</w:t>
@@ -8477,6 +9275,10 @@
             <w:tcW w:type="dxa" w:w="4818"/>
           </w:tcPr>
           <w:p>
+            <w:pPr>
+              <w:pStyle w:val="Normalfigure-table"/>
+              <w:keepNext/>
+            </w:pPr>
             <w:r/>
             <w:r>
               <w:t>0.17.2, stable-tensorrt image</w:t>
@@ -8485,11 +9287,18 @@
         </w:tc>
       </w:tr>
       <w:tr>
+        <w:trPr>
+          <w:cantSplit/>
+        </w:trPr>
         <w:tc>
           <w:tcPr>
             <w:tcW w:type="dxa" w:w="4818"/>
           </w:tcPr>
           <w:p>
+            <w:pPr>
+              <w:pStyle w:val="Normalfigure-table"/>
+              <w:keepNext/>
+            </w:pPr>
             <w:r/>
             <w:r>
               <w:t>Detektor</w:t>
@@ -8501,6 +9310,10 @@
             <w:tcW w:type="dxa" w:w="4818"/>
           </w:tcPr>
           <w:p>
+            <w:pPr>
+              <w:pStyle w:val="Normalfigure-table"/>
+              <w:keepNext/>
+            </w:pPr>
             <w:r/>
             <w:r>
               <w:t>ONNX Runtime, yolo-generic modell, 320×320 bemenet, COCO-80 címkekészlet</w:t>
@@ -8509,11 +9322,18 @@
         </w:tc>
       </w:tr>
       <w:tr>
+        <w:trPr>
+          <w:cantSplit/>
+        </w:trPr>
         <w:tc>
           <w:tcPr>
             <w:tcW w:type="dxa" w:w="4818"/>
           </w:tcPr>
           <w:p>
+            <w:pPr>
+              <w:pStyle w:val="Normalfigure-table"/>
+              <w:keepNext/>
+            </w:pPr>
             <w:r/>
             <w:r>
               <w:t>Backend</w:t>
@@ -8525,6 +9345,10 @@
             <w:tcW w:type="dxa" w:w="4818"/>
           </w:tcPr>
           <w:p>
+            <w:pPr>
+              <w:pStyle w:val="Normalfigure-table"/>
+              <w:keepNext/>
+            </w:pPr>
             <w:r/>
             <w:r>
               <w:t>Python 3.12, FastAPI 0.141</w:t>
@@ -8533,11 +9357,17 @@
         </w:tc>
       </w:tr>
       <w:tr>
+        <w:trPr>
+          <w:cantSplit/>
+        </w:trPr>
         <w:tc>
           <w:tcPr>
             <w:tcW w:type="dxa" w:w="4818"/>
           </w:tcPr>
           <w:p>
+            <w:pPr>
+              <w:pStyle w:val="Normalfigure-table"/>
+            </w:pPr>
             <w:r/>
             <w:r>
               <w:t>Kamera-node</w:t>
@@ -8549,6 +9379,9 @@
             <w:tcW w:type="dxa" w:w="4818"/>
           </w:tcPr>
           <w:p>
+            <w:pPr>
+              <w:pStyle w:val="Normalfigure-table"/>
+            </w:pPr>
             <w:r/>
             <w:r>
               <w:t>Android IP Camera, 1280×720, H.264, HTTPS</w:t>
@@ -8608,6 +9441,7 @@
     <w:p>
       <w:pPr>
         <w:pStyle w:val="Caption"/>
+        <w:keepNext/>
       </w:pPr>
       <w:r>
         <w:t>8. táblázat: A konténerek erőforrás-használata a kameraszám függvényében (60 s alatt, 2 s-onként vett minták átlaga)</w:t>
@@ -8628,11 +9462,20 @@
         <w:gridCol w:w="1606"/>
       </w:tblGrid>
       <w:tr>
+        <w:trPr>
+          <w:cantSplit/>
+          <w:tblHeader/>
+        </w:trPr>
         <w:tc>
           <w:tcPr>
             <w:tcW w:type="dxa" w:w="1606"/>
-          </w:tcPr>
-          <w:p>
+            <w:shd w:val="clear" w:color="auto" w:fill="BFBFBF"/>
+          </w:tcPr>
+          <w:p>
+            <w:pPr>
+              <w:pStyle w:val="Normalfigure-table"/>
+              <w:keepNext/>
+            </w:pPr>
             <w:r>
               <w:rPr>
                 <w:b/>
@@ -8649,8 +9492,13 @@
         <w:tc>
           <w:tcPr>
             <w:tcW w:type="dxa" w:w="1606"/>
-          </w:tcPr>
-          <w:p>
+            <w:shd w:val="clear" w:color="auto" w:fill="BFBFBF"/>
+          </w:tcPr>
+          <w:p>
+            <w:pPr>
+              <w:pStyle w:val="Normalfigure-table"/>
+              <w:keepNext/>
+            </w:pPr>
             <w:r>
               <w:rPr>
                 <w:b/>
@@ -8667,8 +9515,13 @@
         <w:tc>
           <w:tcPr>
             <w:tcW w:type="dxa" w:w="1606"/>
-          </w:tcPr>
-          <w:p>
+            <w:shd w:val="clear" w:color="auto" w:fill="BFBFBF"/>
+          </w:tcPr>
+          <w:p>
+            <w:pPr>
+              <w:pStyle w:val="Normalfigure-table"/>
+              <w:keepNext/>
+            </w:pPr>
             <w:r>
               <w:rPr>
                 <w:b/>
@@ -8685,8 +9538,13 @@
         <w:tc>
           <w:tcPr>
             <w:tcW w:type="dxa" w:w="1606"/>
-          </w:tcPr>
-          <w:p>
+            <w:shd w:val="clear" w:color="auto" w:fill="BFBFBF"/>
+          </w:tcPr>
+          <w:p>
+            <w:pPr>
+              <w:pStyle w:val="Normalfigure-table"/>
+              <w:keepNext/>
+            </w:pPr>
             <w:r>
               <w:rPr>
                 <w:b/>
@@ -8703,8 +9561,13 @@
         <w:tc>
           <w:tcPr>
             <w:tcW w:type="dxa" w:w="1606"/>
-          </w:tcPr>
-          <w:p>
+            <w:shd w:val="clear" w:color="auto" w:fill="BFBFBF"/>
+          </w:tcPr>
+          <w:p>
+            <w:pPr>
+              <w:pStyle w:val="Normalfigure-table"/>
+              <w:keepNext/>
+            </w:pPr>
             <w:r>
               <w:rPr>
                 <w:b/>
@@ -8721,8 +9584,13 @@
         <w:tc>
           <w:tcPr>
             <w:tcW w:type="dxa" w:w="1606"/>
-          </w:tcPr>
-          <w:p>
+            <w:shd w:val="clear" w:color="auto" w:fill="BFBFBF"/>
+          </w:tcPr>
+          <w:p>
+            <w:pPr>
+              <w:pStyle w:val="Normalfigure-table"/>
+              <w:keepNext/>
+            </w:pPr>
             <w:r>
               <w:rPr>
                 <w:b/>
@@ -8738,11 +9606,18 @@
         </w:tc>
       </w:tr>
       <w:tr>
+        <w:trPr>
+          <w:cantSplit/>
+        </w:trPr>
         <w:tc>
           <w:tcPr>
             <w:tcW w:type="dxa" w:w="1606"/>
           </w:tcPr>
           <w:p>
+            <w:pPr>
+              <w:pStyle w:val="Normalfigure-table"/>
+              <w:keepNext/>
+            </w:pPr>
             <w:r/>
             <w:r>
               <w:t>frigate — CPU (%)</w:t>
@@ -8754,6 +9629,10 @@
             <w:tcW w:type="dxa" w:w="1606"/>
           </w:tcPr>
           <w:p>
+            <w:pPr>
+              <w:pStyle w:val="Normalfigure-table"/>
+              <w:keepNext/>
+            </w:pPr>
             <w:r/>
             <w:r>
               <w:t>1,0</w:t>
@@ -8765,6 +9644,10 @@
             <w:tcW w:type="dxa" w:w="1606"/>
           </w:tcPr>
           <w:p>
+            <w:pPr>
+              <w:pStyle w:val="Normalfigure-table"/>
+              <w:keepNext/>
+            </w:pPr>
             <w:r/>
             <w:r>
               <w:t>11,4</w:t>
@@ -8776,6 +9659,10 @@
             <w:tcW w:type="dxa" w:w="1606"/>
           </w:tcPr>
           <w:p>
+            <w:pPr>
+              <w:pStyle w:val="Normalfigure-table"/>
+              <w:keepNext/>
+            </w:pPr>
             <w:r/>
             <w:r>
               <w:t>20,0</w:t>
@@ -8787,6 +9674,10 @@
             <w:tcW w:type="dxa" w:w="1606"/>
           </w:tcPr>
           <w:p>
+            <w:pPr>
+              <w:pStyle w:val="Normalfigure-table"/>
+              <w:keepNext/>
+            </w:pPr>
             <w:r/>
             <w:r>
               <w:t>32,4</w:t>
@@ -8798,6 +9689,10 @@
             <w:tcW w:type="dxa" w:w="1606"/>
           </w:tcPr>
           <w:p>
+            <w:pPr>
+              <w:pStyle w:val="Normalfigure-table"/>
+              <w:keepNext/>
+            </w:pPr>
             <w:r/>
             <w:r>
               <w:t>43,5</w:t>
@@ -8806,11 +9701,18 @@
         </w:tc>
       </w:tr>
       <w:tr>
+        <w:trPr>
+          <w:cantSplit/>
+        </w:trPr>
         <w:tc>
           <w:tcPr>
             <w:tcW w:type="dxa" w:w="1606"/>
           </w:tcPr>
           <w:p>
+            <w:pPr>
+              <w:pStyle w:val="Normalfigure-table"/>
+              <w:keepNext/>
+            </w:pPr>
             <w:r/>
             <w:r>
               <w:t>frigate — memória (MiB)</w:t>
@@ -8822,6 +9724,10 @@
             <w:tcW w:type="dxa" w:w="1606"/>
           </w:tcPr>
           <w:p>
+            <w:pPr>
+              <w:pStyle w:val="Normalfigure-table"/>
+              <w:keepNext/>
+            </w:pPr>
             <w:r/>
             <w:r>
               <w:t>851</w:t>
@@ -8833,6 +9739,10 @@
             <w:tcW w:type="dxa" w:w="1606"/>
           </w:tcPr>
           <w:p>
+            <w:pPr>
+              <w:pStyle w:val="Normalfigure-table"/>
+              <w:keepNext/>
+            </w:pPr>
             <w:r/>
             <w:r>
               <w:t>1414</w:t>
@@ -8844,6 +9754,10 @@
             <w:tcW w:type="dxa" w:w="1606"/>
           </w:tcPr>
           <w:p>
+            <w:pPr>
+              <w:pStyle w:val="Normalfigure-table"/>
+              <w:keepNext/>
+            </w:pPr>
             <w:r/>
             <w:r>
               <w:t>1521</w:t>
@@ -8855,6 +9769,10 @@
             <w:tcW w:type="dxa" w:w="1606"/>
           </w:tcPr>
           <w:p>
+            <w:pPr>
+              <w:pStyle w:val="Normalfigure-table"/>
+              <w:keepNext/>
+            </w:pPr>
             <w:r/>
             <w:r>
               <w:t>1632</w:t>
@@ -8866,6 +9784,10 @@
             <w:tcW w:type="dxa" w:w="1606"/>
           </w:tcPr>
           <w:p>
+            <w:pPr>
+              <w:pStyle w:val="Normalfigure-table"/>
+              <w:keepNext/>
+            </w:pPr>
             <w:r/>
             <w:r>
               <w:t>1725</w:t>
@@ -8874,11 +9796,18 @@
         </w:tc>
       </w:tr>
       <w:tr>
+        <w:trPr>
+          <w:cantSplit/>
+        </w:trPr>
         <w:tc>
           <w:tcPr>
             <w:tcW w:type="dxa" w:w="1606"/>
           </w:tcPr>
           <w:p>
+            <w:pPr>
+              <w:pStyle w:val="Normalfigure-table"/>
+              <w:keepNext/>
+            </w:pPr>
             <w:r/>
             <w:r>
               <w:t>backend — CPU (%)</w:t>
@@ -8890,6 +9819,10 @@
             <w:tcW w:type="dxa" w:w="1606"/>
           </w:tcPr>
           <w:p>
+            <w:pPr>
+              <w:pStyle w:val="Normalfigure-table"/>
+              <w:keepNext/>
+            </w:pPr>
             <w:r/>
             <w:r>
               <w:t>0,40</w:t>
@@ -8901,6 +9834,10 @@
             <w:tcW w:type="dxa" w:w="1606"/>
           </w:tcPr>
           <w:p>
+            <w:pPr>
+              <w:pStyle w:val="Normalfigure-table"/>
+              <w:keepNext/>
+            </w:pPr>
             <w:r/>
             <w:r>
               <w:t>0,56</w:t>
@@ -8912,6 +9849,10 @@
             <w:tcW w:type="dxa" w:w="1606"/>
           </w:tcPr>
           <w:p>
+            <w:pPr>
+              <w:pStyle w:val="Normalfigure-table"/>
+              <w:keepNext/>
+            </w:pPr>
             <w:r/>
             <w:r>
               <w:t>0,45</w:t>
@@ -8923,6 +9864,10 @@
             <w:tcW w:type="dxa" w:w="1606"/>
           </w:tcPr>
           <w:p>
+            <w:pPr>
+              <w:pStyle w:val="Normalfigure-table"/>
+              <w:keepNext/>
+            </w:pPr>
             <w:r/>
             <w:r>
               <w:t>0,61</w:t>
@@ -8934,6 +9879,10 @@
             <w:tcW w:type="dxa" w:w="1606"/>
           </w:tcPr>
           <w:p>
+            <w:pPr>
+              <w:pStyle w:val="Normalfigure-table"/>
+              <w:keepNext/>
+            </w:pPr>
             <w:r/>
             <w:r>
               <w:t>0,55</w:t>
@@ -8942,11 +9891,18 @@
         </w:tc>
       </w:tr>
       <w:tr>
+        <w:trPr>
+          <w:cantSplit/>
+        </w:trPr>
         <w:tc>
           <w:tcPr>
             <w:tcW w:type="dxa" w:w="1606"/>
           </w:tcPr>
           <w:p>
+            <w:pPr>
+              <w:pStyle w:val="Normalfigure-table"/>
+              <w:keepNext/>
+            </w:pPr>
             <w:r/>
             <w:r>
               <w:t>backend — memória (MiB)</w:t>
@@ -8958,6 +9914,10 @@
             <w:tcW w:type="dxa" w:w="1606"/>
           </w:tcPr>
           <w:p>
+            <w:pPr>
+              <w:pStyle w:val="Normalfigure-table"/>
+              <w:keepNext/>
+            </w:pPr>
             <w:r/>
             <w:r>
               <w:t>48</w:t>
@@ -8969,6 +9929,10 @@
             <w:tcW w:type="dxa" w:w="1606"/>
           </w:tcPr>
           <w:p>
+            <w:pPr>
+              <w:pStyle w:val="Normalfigure-table"/>
+              <w:keepNext/>
+            </w:pPr>
             <w:r/>
             <w:r>
               <w:t>49</w:t>
@@ -8980,6 +9944,10 @@
             <w:tcW w:type="dxa" w:w="1606"/>
           </w:tcPr>
           <w:p>
+            <w:pPr>
+              <w:pStyle w:val="Normalfigure-table"/>
+              <w:keepNext/>
+            </w:pPr>
             <w:r/>
             <w:r>
               <w:t>50</w:t>
@@ -8991,6 +9959,10 @@
             <w:tcW w:type="dxa" w:w="1606"/>
           </w:tcPr>
           <w:p>
+            <w:pPr>
+              <w:pStyle w:val="Normalfigure-table"/>
+              <w:keepNext/>
+            </w:pPr>
             <w:r/>
             <w:r>
               <w:t>52</w:t>
@@ -9002,6 +9974,10 @@
             <w:tcW w:type="dxa" w:w="1606"/>
           </w:tcPr>
           <w:p>
+            <w:pPr>
+              <w:pStyle w:val="Normalfigure-table"/>
+              <w:keepNext/>
+            </w:pPr>
             <w:r/>
             <w:r>
               <w:t>52</w:t>
@@ -9010,11 +9986,18 @@
         </w:tc>
       </w:tr>
       <w:tr>
+        <w:trPr>
+          <w:cantSplit/>
+        </w:trPr>
         <w:tc>
           <w:tcPr>
             <w:tcW w:type="dxa" w:w="1606"/>
           </w:tcPr>
           <w:p>
+            <w:pPr>
+              <w:pStyle w:val="Normalfigure-table"/>
+              <w:keepNext/>
+            </w:pPr>
             <w:r/>
             <w:r>
               <w:t>fire-detector — CPU (%)</w:t>
@@ -9026,6 +10009,10 @@
             <w:tcW w:type="dxa" w:w="1606"/>
           </w:tcPr>
           <w:p>
+            <w:pPr>
+              <w:pStyle w:val="Normalfigure-table"/>
+              <w:keepNext/>
+            </w:pPr>
             <w:r/>
             <w:r>
               <w:t>0,40</w:t>
@@ -9037,6 +10024,10 @@
             <w:tcW w:type="dxa" w:w="1606"/>
           </w:tcPr>
           <w:p>
+            <w:pPr>
+              <w:pStyle w:val="Normalfigure-table"/>
+              <w:keepNext/>
+            </w:pPr>
             <w:r/>
             <w:r>
               <w:t>0,27</w:t>
@@ -9048,6 +10039,10 @@
             <w:tcW w:type="dxa" w:w="1606"/>
           </w:tcPr>
           <w:p>
+            <w:pPr>
+              <w:pStyle w:val="Normalfigure-table"/>
+              <w:keepNext/>
+            </w:pPr>
             <w:r/>
             <w:r>
               <w:t>0,36</w:t>
@@ -9059,6 +10054,10 @@
             <w:tcW w:type="dxa" w:w="1606"/>
           </w:tcPr>
           <w:p>
+            <w:pPr>
+              <w:pStyle w:val="Normalfigure-table"/>
+              <w:keepNext/>
+            </w:pPr>
             <w:r/>
             <w:r>
               <w:t>0,33</w:t>
@@ -9070,6 +10069,10 @@
             <w:tcW w:type="dxa" w:w="1606"/>
           </w:tcPr>
           <w:p>
+            <w:pPr>
+              <w:pStyle w:val="Normalfigure-table"/>
+              <w:keepNext/>
+            </w:pPr>
             <w:r/>
             <w:r>
               <w:t>0,32</w:t>
@@ -9078,11 +10081,18 @@
         </w:tc>
       </w:tr>
       <w:tr>
+        <w:trPr>
+          <w:cantSplit/>
+        </w:trPr>
         <w:tc>
           <w:tcPr>
             <w:tcW w:type="dxa" w:w="1606"/>
           </w:tcPr>
           <w:p>
+            <w:pPr>
+              <w:pStyle w:val="Normalfigure-table"/>
+              <w:keepNext/>
+            </w:pPr>
             <w:r/>
             <w:r>
               <w:t>fire-detector — memória (MiB)</w:t>
@@ -9094,6 +10104,10 @@
             <w:tcW w:type="dxa" w:w="1606"/>
           </w:tcPr>
           <w:p>
+            <w:pPr>
+              <w:pStyle w:val="Normalfigure-table"/>
+              <w:keepNext/>
+            </w:pPr>
             <w:r/>
             <w:r>
               <w:t>131</w:t>
@@ -9105,6 +10119,10 @@
             <w:tcW w:type="dxa" w:w="1606"/>
           </w:tcPr>
           <w:p>
+            <w:pPr>
+              <w:pStyle w:val="Normalfigure-table"/>
+              <w:keepNext/>
+            </w:pPr>
             <w:r/>
             <w:r>
               <w:t>131</w:t>
@@ -9116,6 +10134,10 @@
             <w:tcW w:type="dxa" w:w="1606"/>
           </w:tcPr>
           <w:p>
+            <w:pPr>
+              <w:pStyle w:val="Normalfigure-table"/>
+              <w:keepNext/>
+            </w:pPr>
             <w:r/>
             <w:r>
               <w:t>131</w:t>
@@ -9127,6 +10149,10 @@
             <w:tcW w:type="dxa" w:w="1606"/>
           </w:tcPr>
           <w:p>
+            <w:pPr>
+              <w:pStyle w:val="Normalfigure-table"/>
+              <w:keepNext/>
+            </w:pPr>
             <w:r/>
             <w:r>
               <w:t>131</w:t>
@@ -9138,6 +10164,10 @@
             <w:tcW w:type="dxa" w:w="1606"/>
           </w:tcPr>
           <w:p>
+            <w:pPr>
+              <w:pStyle w:val="Normalfigure-table"/>
+              <w:keepNext/>
+            </w:pPr>
             <w:r/>
             <w:r>
               <w:t>131</w:t>
@@ -9146,11 +10176,18 @@
         </w:tc>
       </w:tr>
       <w:tr>
+        <w:trPr>
+          <w:cantSplit/>
+        </w:trPr>
         <w:tc>
           <w:tcPr>
             <w:tcW w:type="dxa" w:w="1606"/>
           </w:tcPr>
           <w:p>
+            <w:pPr>
+              <w:pStyle w:val="Normalfigure-table"/>
+              <w:keepNext/>
+            </w:pPr>
             <w:r/>
             <w:r>
               <w:t>mosquitto — CPU (%)</w:t>
@@ -9162,6 +10199,10 @@
             <w:tcW w:type="dxa" w:w="1606"/>
           </w:tcPr>
           <w:p>
+            <w:pPr>
+              <w:pStyle w:val="Normalfigure-table"/>
+              <w:keepNext/>
+            </w:pPr>
             <w:r/>
             <w:r>
               <w:t>0,04</w:t>
@@ -9173,6 +10214,10 @@
             <w:tcW w:type="dxa" w:w="1606"/>
           </w:tcPr>
           <w:p>
+            <w:pPr>
+              <w:pStyle w:val="Normalfigure-table"/>
+              <w:keepNext/>
+            </w:pPr>
             <w:r/>
             <w:r>
               <w:t>0,04</w:t>
@@ -9184,6 +10229,10 @@
             <w:tcW w:type="dxa" w:w="1606"/>
           </w:tcPr>
           <w:p>
+            <w:pPr>
+              <w:pStyle w:val="Normalfigure-table"/>
+              <w:keepNext/>
+            </w:pPr>
             <w:r/>
             <w:r>
               <w:t>0,03</w:t>
@@ -9195,6 +10244,10 @@
             <w:tcW w:type="dxa" w:w="1606"/>
           </w:tcPr>
           <w:p>
+            <w:pPr>
+              <w:pStyle w:val="Normalfigure-table"/>
+              <w:keepNext/>
+            </w:pPr>
             <w:r/>
             <w:r>
               <w:t>0,03</w:t>
@@ -9206,6 +10259,10 @@
             <w:tcW w:type="dxa" w:w="1606"/>
           </w:tcPr>
           <w:p>
+            <w:pPr>
+              <w:pStyle w:val="Normalfigure-table"/>
+              <w:keepNext/>
+            </w:pPr>
             <w:r/>
             <w:r>
               <w:t>0,03</w:t>
@@ -9214,11 +10271,17 @@
         </w:tc>
       </w:tr>
       <w:tr>
+        <w:trPr>
+          <w:cantSplit/>
+        </w:trPr>
         <w:tc>
           <w:tcPr>
             <w:tcW w:type="dxa" w:w="1606"/>
           </w:tcPr>
           <w:p>
+            <w:pPr>
+              <w:pStyle w:val="Normalfigure-table"/>
+            </w:pPr>
             <w:r/>
             <w:r>
               <w:t>dashboard — CPU (%)</w:t>
@@ -9230,6 +10293,9 @@
             <w:tcW w:type="dxa" w:w="1606"/>
           </w:tcPr>
           <w:p>
+            <w:pPr>
+              <w:pStyle w:val="Normalfigure-table"/>
+            </w:pPr>
             <w:r/>
             <w:r>
               <w:t>0,00</w:t>
@@ -9241,6 +10307,9 @@
             <w:tcW w:type="dxa" w:w="1606"/>
           </w:tcPr>
           <w:p>
+            <w:pPr>
+              <w:pStyle w:val="Normalfigure-table"/>
+            </w:pPr>
             <w:r/>
             <w:r>
               <w:t>0,01</w:t>
@@ -9252,6 +10321,9 @@
             <w:tcW w:type="dxa" w:w="1606"/>
           </w:tcPr>
           <w:p>
+            <w:pPr>
+              <w:pStyle w:val="Normalfigure-table"/>
+            </w:pPr>
             <w:r/>
             <w:r>
               <w:t>0,01</w:t>
@@ -9263,6 +10335,9 @@
             <w:tcW w:type="dxa" w:w="1606"/>
           </w:tcPr>
           <w:p>
+            <w:pPr>
+              <w:pStyle w:val="Normalfigure-table"/>
+            </w:pPr>
             <w:r/>
             <w:r>
               <w:t>0,01</w:t>
@@ -9274,6 +10349,9 @@
             <w:tcW w:type="dxa" w:w="1606"/>
           </w:tcPr>
           <w:p>
+            <w:pPr>
+              <w:pStyle w:val="Normalfigure-table"/>
+            </w:pPr>
             <w:r/>
             <w:r>
               <w:t>0,01</w:t>
@@ -9398,6 +10476,7 @@
     <w:p>
       <w:pPr>
         <w:pStyle w:val="Caption"/>
+        <w:keepNext/>
       </w:pPr>
       <w:r>
         <w:t>9. táblázat: A detektor következtetési ideje GPU-gyorsítással és processzoron (azonos modell, azonos bemenet, 3 kamera, telített detektor)</w:t>
@@ -9415,11 +10494,20 @@
         <w:gridCol w:w="3212"/>
       </w:tblGrid>
       <w:tr>
+        <w:trPr>
+          <w:cantSplit/>
+          <w:tblHeader/>
+        </w:trPr>
         <w:tc>
           <w:tcPr>
             <w:tcW w:type="dxa" w:w="3212"/>
-          </w:tcPr>
-          <w:p>
+            <w:shd w:val="clear" w:color="auto" w:fill="BFBFBF"/>
+          </w:tcPr>
+          <w:p>
+            <w:pPr>
+              <w:pStyle w:val="Normalfigure-table"/>
+              <w:keepNext/>
+            </w:pPr>
             <w:r>
               <w:rPr>
                 <w:b/>
@@ -9436,8 +10524,13 @@
         <w:tc>
           <w:tcPr>
             <w:tcW w:type="dxa" w:w="3212"/>
-          </w:tcPr>
-          <w:p>
+            <w:shd w:val="clear" w:color="auto" w:fill="BFBFBF"/>
+          </w:tcPr>
+          <w:p>
+            <w:pPr>
+              <w:pStyle w:val="Normalfigure-table"/>
+              <w:keepNext/>
+            </w:pPr>
             <w:r>
               <w:rPr>
                 <w:b/>
@@ -9454,8 +10547,13 @@
         <w:tc>
           <w:tcPr>
             <w:tcW w:type="dxa" w:w="3212"/>
-          </w:tcPr>
-          <w:p>
+            <w:shd w:val="clear" w:color="auto" w:fill="BFBFBF"/>
+          </w:tcPr>
+          <w:p>
+            <w:pPr>
+              <w:pStyle w:val="Normalfigure-table"/>
+              <w:keepNext/>
+            </w:pPr>
             <w:r>
               <w:rPr>
                 <w:b/>
@@ -9471,11 +10569,18 @@
         </w:tc>
       </w:tr>
       <w:tr>
+        <w:trPr>
+          <w:cantSplit/>
+        </w:trPr>
         <w:tc>
           <w:tcPr>
             <w:tcW w:type="dxa" w:w="3212"/>
           </w:tcPr>
           <w:p>
+            <w:pPr>
+              <w:pStyle w:val="Normalfigure-table"/>
+              <w:keepNext/>
+            </w:pPr>
             <w:r/>
             <w:r>
               <w:t>Következtetési idő képkockánként (ms)</w:t>
@@ -9487,6 +10592,10 @@
             <w:tcW w:type="dxa" w:w="3212"/>
           </w:tcPr>
           <w:p>
+            <w:pPr>
+              <w:pStyle w:val="Normalfigure-table"/>
+              <w:keepNext/>
+            </w:pPr>
             <w:r/>
             <w:r>
               <w:t>5,54</w:t>
@@ -9498,6 +10607,10 @@
             <w:tcW w:type="dxa" w:w="3212"/>
           </w:tcPr>
           <w:p>
+            <w:pPr>
+              <w:pStyle w:val="Normalfigure-table"/>
+              <w:keepNext/>
+            </w:pPr>
             <w:r/>
             <w:r>
               <w:t>43,12</w:t>
@@ -9506,11 +10619,18 @@
         </w:tc>
       </w:tr>
       <w:tr>
+        <w:trPr>
+          <w:cantSplit/>
+        </w:trPr>
         <w:tc>
           <w:tcPr>
             <w:tcW w:type="dxa" w:w="3212"/>
           </w:tcPr>
           <w:p>
+            <w:pPr>
+              <w:pStyle w:val="Normalfigure-table"/>
+              <w:keepNext/>
+            </w:pPr>
             <w:r/>
             <w:r>
               <w:t>Legnagyobb mért következtetési idő (ms)</w:t>
@@ -9522,6 +10642,10 @@
             <w:tcW w:type="dxa" w:w="3212"/>
           </w:tcPr>
           <w:p>
+            <w:pPr>
+              <w:pStyle w:val="Normalfigure-table"/>
+              <w:keepNext/>
+            </w:pPr>
             <w:r/>
             <w:r>
               <w:t>5,57</w:t>
@@ -9533,6 +10657,10 @@
             <w:tcW w:type="dxa" w:w="3212"/>
           </w:tcPr>
           <w:p>
+            <w:pPr>
+              <w:pStyle w:val="Normalfigure-table"/>
+              <w:keepNext/>
+            </w:pPr>
             <w:r/>
             <w:r>
               <w:t>47,07</w:t>
@@ -9541,11 +10669,18 @@
         </w:tc>
       </w:tr>
       <w:tr>
+        <w:trPr>
+          <w:cantSplit/>
+        </w:trPr>
         <w:tc>
           <w:tcPr>
             <w:tcW w:type="dxa" w:w="3212"/>
           </w:tcPr>
           <w:p>
+            <w:pPr>
+              <w:pStyle w:val="Normalfigure-table"/>
+              <w:keepNext/>
+            </w:pPr>
             <w:r/>
             <w:r>
               <w:t>Összesített detekciós képsebesség (kép/s)</w:t>
@@ -9557,6 +10692,10 @@
             <w:tcW w:type="dxa" w:w="3212"/>
           </w:tcPr>
           <w:p>
+            <w:pPr>
+              <w:pStyle w:val="Normalfigure-table"/>
+              <w:keepNext/>
+            </w:pPr>
             <w:r/>
             <w:r>
               <w:t>15,68</w:t>
@@ -9568,6 +10707,10 @@
             <w:tcW w:type="dxa" w:w="3212"/>
           </w:tcPr>
           <w:p>
+            <w:pPr>
+              <w:pStyle w:val="Normalfigure-table"/>
+              <w:keepNext/>
+            </w:pPr>
             <w:r/>
             <w:r>
               <w:t>14,07</w:t>
@@ -9576,11 +10719,17 @@
         </w:tc>
       </w:tr>
       <w:tr>
+        <w:trPr>
+          <w:cantSplit/>
+        </w:trPr>
         <w:tc>
           <w:tcPr>
             <w:tcW w:type="dxa" w:w="3212"/>
           </w:tcPr>
           <w:p>
+            <w:pPr>
+              <w:pStyle w:val="Normalfigure-table"/>
+            </w:pPr>
             <w:r/>
             <w:r>
               <w:t>Elméleti detekciós felső korlát (kép/s)</w:t>
@@ -9592,6 +10741,9 @@
             <w:tcW w:type="dxa" w:w="3212"/>
           </w:tcPr>
           <w:p>
+            <w:pPr>
+              <w:pStyle w:val="Normalfigure-table"/>
+            </w:pPr>
             <w:r/>
             <w:r>
               <w:t>180,5</w:t>
@@ -9603,6 +10755,9 @@
             <w:tcW w:type="dxa" w:w="3212"/>
           </w:tcPr>
           <w:p>
+            <w:pPr>
+              <w:pStyle w:val="Normalfigure-table"/>
+            </w:pPr>
             <w:r/>
             <w:r>
               <w:t>23,2</w:t>
@@ -9664,6 +10819,7 @@
     <w:p>
       <w:pPr>
         <w:pStyle w:val="Caption"/>
+        <w:keepNext/>
       </w:pPr>
       <w:r>
         <w:t>10. táblázat: Az állapotfigyelő hurok periódusa és az MQTT → WebSocket átjátszási késleltetés</w:t>
@@ -9680,11 +10836,20 @@
         <w:gridCol w:w="4818"/>
       </w:tblGrid>
       <w:tr>
+        <w:trPr>
+          <w:cantSplit/>
+          <w:tblHeader/>
+        </w:trPr>
         <w:tc>
           <w:tcPr>
             <w:tcW w:type="dxa" w:w="4818"/>
-          </w:tcPr>
-          <w:p>
+            <w:shd w:val="clear" w:color="auto" w:fill="BFBFBF"/>
+          </w:tcPr>
+          <w:p>
+            <w:pPr>
+              <w:pStyle w:val="Normalfigure-table"/>
+              <w:keepNext/>
+            </w:pPr>
             <w:r>
               <w:rPr>
                 <w:b/>
@@ -9701,8 +10866,13 @@
         <w:tc>
           <w:tcPr>
             <w:tcW w:type="dxa" w:w="4818"/>
-          </w:tcPr>
-          <w:p>
+            <w:shd w:val="clear" w:color="auto" w:fill="BFBFBF"/>
+          </w:tcPr>
+          <w:p>
+            <w:pPr>
+              <w:pStyle w:val="Normalfigure-table"/>
+              <w:keepNext/>
+            </w:pPr>
             <w:r>
               <w:rPr>
                 <w:b/>
@@ -9718,11 +10888,18 @@
         </w:tc>
       </w:tr>
       <w:tr>
+        <w:trPr>
+          <w:cantSplit/>
+        </w:trPr>
         <w:tc>
           <w:tcPr>
             <w:tcW w:type="dxa" w:w="4818"/>
           </w:tcPr>
           <w:p>
+            <w:pPr>
+              <w:pStyle w:val="Normalfigure-table"/>
+              <w:keepNext/>
+            </w:pPr>
             <w:r/>
             <w:r>
               <w:t>Az állapotfigyelő hurok átlagos periódusa (s)</w:t>
@@ -9734,6 +10911,10 @@
             <w:tcW w:type="dxa" w:w="4818"/>
           </w:tcPr>
           <w:p>
+            <w:pPr>
+              <w:pStyle w:val="Normalfigure-table"/>
+              <w:keepNext/>
+            </w:pPr>
             <w:r/>
             <w:r>
               <w:t>7,842</w:t>
@@ -9742,11 +10923,18 @@
         </w:tc>
       </w:tr>
       <w:tr>
+        <w:trPr>
+          <w:cantSplit/>
+        </w:trPr>
         <w:tc>
           <w:tcPr>
             <w:tcW w:type="dxa" w:w="4818"/>
           </w:tcPr>
           <w:p>
+            <w:pPr>
+              <w:pStyle w:val="Normalfigure-table"/>
+              <w:keepNext/>
+            </w:pPr>
             <w:r/>
             <w:r>
               <w:t>A periódus szórása (s)</w:t>
@@ -9758,6 +10946,10 @@
             <w:tcW w:type="dxa" w:w="4818"/>
           </w:tcPr>
           <w:p>
+            <w:pPr>
+              <w:pStyle w:val="Normalfigure-table"/>
+              <w:keepNext/>
+            </w:pPr>
             <w:r/>
             <w:r>
               <w:t>1,945</w:t>
@@ -9766,11 +10958,18 @@
         </w:tc>
       </w:tr>
       <w:tr>
+        <w:trPr>
+          <w:cantSplit/>
+        </w:trPr>
         <w:tc>
           <w:tcPr>
             <w:tcW w:type="dxa" w:w="4818"/>
           </w:tcPr>
           <w:p>
+            <w:pPr>
+              <w:pStyle w:val="Normalfigure-table"/>
+              <w:keepNext/>
+            </w:pPr>
             <w:r/>
             <w:r>
               <w:t>Átjátszási késleltetés — átlag (ms)</w:t>
@@ -9782,6 +10981,10 @@
             <w:tcW w:type="dxa" w:w="4818"/>
           </w:tcPr>
           <w:p>
+            <w:pPr>
+              <w:pStyle w:val="Normalfigure-table"/>
+              <w:keepNext/>
+            </w:pPr>
             <w:r/>
             <w:r>
               <w:t>0,7</w:t>
@@ -9790,11 +10993,18 @@
         </w:tc>
       </w:tr>
       <w:tr>
+        <w:trPr>
+          <w:cantSplit/>
+        </w:trPr>
         <w:tc>
           <w:tcPr>
             <w:tcW w:type="dxa" w:w="4818"/>
           </w:tcPr>
           <w:p>
+            <w:pPr>
+              <w:pStyle w:val="Normalfigure-table"/>
+              <w:keepNext/>
+            </w:pPr>
             <w:r/>
             <w:r>
               <w:t>Átjátszási késleltetés — 95. percentilis (ms)</w:t>
@@ -9806,6 +11016,10 @@
             <w:tcW w:type="dxa" w:w="4818"/>
           </w:tcPr>
           <w:p>
+            <w:pPr>
+              <w:pStyle w:val="Normalfigure-table"/>
+              <w:keepNext/>
+            </w:pPr>
             <w:r/>
             <w:r>
               <w:t>1,2</w:t>
@@ -9814,11 +11028,18 @@
         </w:tc>
       </w:tr>
       <w:tr>
+        <w:trPr>
+          <w:cantSplit/>
+        </w:trPr>
         <w:tc>
           <w:tcPr>
             <w:tcW w:type="dxa" w:w="4818"/>
           </w:tcPr>
           <w:p>
+            <w:pPr>
+              <w:pStyle w:val="Normalfigure-table"/>
+              <w:keepNext/>
+            </w:pPr>
             <w:r/>
             <w:r>
               <w:t>Illesztett eseménypárok száma</w:t>
@@ -9830,6 +11051,10 @@
             <w:tcW w:type="dxa" w:w="4818"/>
           </w:tcPr>
           <w:p>
+            <w:pPr>
+              <w:pStyle w:val="Normalfigure-table"/>
+              <w:keepNext/>
+            </w:pPr>
             <w:r/>
             <w:r>
               <w:t>29</w:t>
@@ -9838,11 +11063,17 @@
         </w:tc>
       </w:tr>
       <w:tr>
+        <w:trPr>
+          <w:cantSplit/>
+        </w:trPr>
         <w:tc>
           <w:tcPr>
             <w:tcW w:type="dxa" w:w="4818"/>
           </w:tcPr>
           <w:p>
+            <w:pPr>
+              <w:pStyle w:val="Normalfigure-table"/>
+            </w:pPr>
             <w:r/>
             <w:r>
               <w:t>A mérés hossza (s)</w:t>
@@ -9854,6 +11085,9 @@
             <w:tcW w:type="dxa" w:w="4818"/>
           </w:tcPr>
           <w:p>
+            <w:pPr>
+              <w:pStyle w:val="Normalfigure-table"/>
+            </w:pPr>
             <w:r/>
             <w:r>
               <w:t>120</w:t>
@@ -9897,6 +11131,7 @@
     <w:p>
       <w:pPr>
         <w:pStyle w:val="Caption"/>
+        <w:keepNext/>
       </w:pPr>
       <w:r>
         <w:t>11. táblázat: Az élőkép két megvalósításának összehasonlítása</w:t>
@@ -9914,11 +11149,20 @@
         <w:gridCol w:w="3212"/>
       </w:tblGrid>
       <w:tr>
+        <w:trPr>
+          <w:cantSplit/>
+          <w:tblHeader/>
+        </w:trPr>
         <w:tc>
           <w:tcPr>
             <w:tcW w:type="dxa" w:w="3212"/>
-          </w:tcPr>
-          <w:p>
+            <w:shd w:val="clear" w:color="auto" w:fill="BFBFBF"/>
+          </w:tcPr>
+          <w:p>
+            <w:pPr>
+              <w:pStyle w:val="Normalfigure-table"/>
+              <w:keepNext/>
+            </w:pPr>
             <w:r>
               <w:rPr>
                 <w:b/>
@@ -9935,8 +11179,13 @@
         <w:tc>
           <w:tcPr>
             <w:tcW w:type="dxa" w:w="3212"/>
-          </w:tcPr>
-          <w:p>
+            <w:shd w:val="clear" w:color="auto" w:fill="BFBFBF"/>
+          </w:tcPr>
+          <w:p>
+            <w:pPr>
+              <w:pStyle w:val="Normalfigure-table"/>
+              <w:keepNext/>
+            </w:pPr>
             <w:r>
               <w:rPr>
                 <w:b/>
@@ -9953,8 +11202,13 @@
         <w:tc>
           <w:tcPr>
             <w:tcW w:type="dxa" w:w="3212"/>
-          </w:tcPr>
-          <w:p>
+            <w:shd w:val="clear" w:color="auto" w:fill="BFBFBF"/>
+          </w:tcPr>
+          <w:p>
+            <w:pPr>
+              <w:pStyle w:val="Normalfigure-table"/>
+              <w:keepNext/>
+            </w:pPr>
             <w:r>
               <w:rPr>
                 <w:b/>
@@ -9970,11 +11224,18 @@
         </w:tc>
       </w:tr>
       <w:tr>
+        <w:trPr>
+          <w:cantSplit/>
+        </w:trPr>
         <w:tc>
           <w:tcPr>
             <w:tcW w:type="dxa" w:w="3212"/>
           </w:tcPr>
           <w:p>
+            <w:pPr>
+              <w:pStyle w:val="Normalfigure-table"/>
+              <w:keepNext/>
+            </w:pPr>
             <w:r/>
             <w:r>
               <w:t>Megjelenített felbontás</w:t>
@@ -9986,6 +11247,10 @@
             <w:tcW w:type="dxa" w:w="3212"/>
           </w:tcPr>
           <w:p>
+            <w:pPr>
+              <w:pStyle w:val="Normalfigure-table"/>
+              <w:keepNext/>
+            </w:pPr>
             <w:r/>
             <w:r>
               <w:t>640×360 (a detekciós méret)</w:t>
@@ -9997,6 +11262,10 @@
             <w:tcW w:type="dxa" w:w="3212"/>
           </w:tcPr>
           <w:p>
+            <w:pPr>
+              <w:pStyle w:val="Normalfigure-table"/>
+              <w:keepNext/>
+            </w:pPr>
             <w:r/>
             <w:r>
               <w:t>1280×720 (a telefon natív mérete)</w:t>
@@ -10005,11 +11274,18 @@
         </w:tc>
       </w:tr>
       <w:tr>
+        <w:trPr>
+          <w:cantSplit/>
+        </w:trPr>
         <w:tc>
           <w:tcPr>
             <w:tcW w:type="dxa" w:w="3212"/>
           </w:tcPr>
           <w:p>
+            <w:pPr>
+              <w:pStyle w:val="Normalfigure-table"/>
+              <w:keepNext/>
+            </w:pPr>
             <w:r/>
             <w:r>
               <w:t>Képfrissítés</w:t>
@@ -10021,6 +11297,10 @@
             <w:tcW w:type="dxa" w:w="3212"/>
           </w:tcPr>
           <w:p>
+            <w:pPr>
+              <w:pStyle w:val="Normalfigure-table"/>
+              <w:keepNext/>
+            </w:pPr>
             <w:r/>
             <w:r>
               <w:t>3,5 kép/s (a detekciós képsebességhez kötve)</w:t>
@@ -10032,6 +11312,10 @@
             <w:tcW w:type="dxa" w:w="3212"/>
           </w:tcPr>
           <w:p>
+            <w:pPr>
+              <w:pStyle w:val="Normalfigure-table"/>
+              <w:keepNext/>
+            </w:pPr>
             <w:r/>
             <w:r>
               <w:t>A telefon képsebessége, a detekciótól függetlenül</w:t>
@@ -10040,11 +11324,18 @@
         </w:tc>
       </w:tr>
       <w:tr>
+        <w:trPr>
+          <w:cantSplit/>
+        </w:trPr>
         <w:tc>
           <w:tcPr>
             <w:tcW w:type="dxa" w:w="3212"/>
           </w:tcPr>
           <w:p>
+            <w:pPr>
+              <w:pStyle w:val="Normalfigure-table"/>
+              <w:keepNext/>
+            </w:pPr>
             <w:r/>
             <w:r>
               <w:t>Frigate processzorterhelése nézőnként</w:t>
@@ -10056,6 +11347,10 @@
             <w:tcW w:type="dxa" w:w="3212"/>
           </w:tcPr>
           <w:p>
+            <w:pPr>
+              <w:pStyle w:val="Normalfigure-table"/>
+              <w:keepNext/>
+            </w:pPr>
             <w:r/>
             <w:r>
               <w:t>+26 százalékpont</w:t>
@@ -10067,6 +11362,10 @@
             <w:tcW w:type="dxa" w:w="3212"/>
           </w:tcPr>
           <w:p>
+            <w:pPr>
+              <w:pStyle w:val="Normalfigure-table"/>
+              <w:keepNext/>
+            </w:pPr>
             <w:r/>
             <w:r>
               <w:t>+2 százalékpont</w:t>
@@ -10075,11 +11374,18 @@
         </w:tc>
       </w:tr>
       <w:tr>
+        <w:trPr>
+          <w:cantSplit/>
+        </w:trPr>
         <w:tc>
           <w:tcPr>
             <w:tcW w:type="dxa" w:w="3212"/>
           </w:tcPr>
           <w:p>
+            <w:pPr>
+              <w:pStyle w:val="Normalfigure-table"/>
+              <w:keepNext/>
+            </w:pPr>
             <w:r/>
             <w:r>
               <w:t>Végponttól végpontig mért késleltetés</w:t>
@@ -10091,6 +11397,10 @@
             <w:tcW w:type="dxa" w:w="3212"/>
           </w:tcPr>
           <w:p>
+            <w:pPr>
+              <w:pStyle w:val="Normalfigure-table"/>
+              <w:keepNext/>
+            </w:pPr>
             <w:r/>
             <w:r>
               <w:t>Nem mérve; szemmel láthatóan magasabb</w:t>
@@ -10102,6 +11412,10 @@
             <w:tcW w:type="dxa" w:w="3212"/>
           </w:tcPr>
           <w:p>
+            <w:pPr>
+              <w:pStyle w:val="Normalfigure-table"/>
+              <w:keepNext/>
+            </w:pPr>
             <w:r/>
             <w:r>
               <w:t>0,03–0,07 s</w:t>
@@ -10110,11 +11424,17 @@
         </w:tc>
       </w:tr>
       <w:tr>
+        <w:trPr>
+          <w:cantSplit/>
+        </w:trPr>
         <w:tc>
           <w:tcPr>
             <w:tcW w:type="dxa" w:w="3212"/>
           </w:tcPr>
           <w:p>
+            <w:pPr>
+              <w:pStyle w:val="Normalfigure-table"/>
+            </w:pPr>
             <w:r/>
             <w:r>
               <w:t>Szerveroldali újrakódolás</w:t>
@@ -10126,6 +11446,9 @@
             <w:tcW w:type="dxa" w:w="3212"/>
           </w:tcPr>
           <w:p>
+            <w:pPr>
+              <w:pStyle w:val="Normalfigure-table"/>
+            </w:pPr>
             <w:r/>
             <w:r>
               <w:t>JPEG-kódolás nézőnként</w:t>
@@ -10137,6 +11460,9 @@
             <w:tcW w:type="dxa" w:w="3212"/>
           </w:tcPr>
           <w:p>
+            <w:pPr>
+              <w:pStyle w:val="Normalfigure-table"/>
+            </w:pPr>
             <w:r/>
             <w:r>
               <w:t>Nincs, csak konténerformátum-váltás</w:t>
@@ -10544,6 +11870,26 @@
     </w:p>
     <w:p>
       <w:pPr>
+        <w:pStyle w:val="Normal"/>
+        <w:rPr/>
+      </w:pPr>
+      <w:r>
+        <w:rPr/>
+        <w:t xml:space="preserve">A dolgozatban bemutatott rendszer fejlesztése során mesterséges intelligencián alapuló eszközöket (Claude, Gemini) használtam: a forráskód egyes részeinek megfogalmazásához és átnézéséhez, a hibakereséshez, valamint a konfigurációs és üzemeltetési lépések ellenőrzéséhez.</w:t>
+      </w:r>
+    </w:p>
+    <w:p>
+      <w:pPr>
+        <w:pStyle w:val="Normal"/>
+        <w:rPr/>
+      </w:pPr>
+      <w:r>
+        <w:rPr/>
+        <w:t>Ugyanezeket az eszközöket a dolgozat szövegének elkészítéséhez is igénybe vettem: a szakirodalom kereséséhez és rendszerezéséhez, a szöveg nyelvi gondozásához és a fejezetszerkezet ellenőrzéséhez. Minden megoldást valós üzemi környezetben ellenőriztem; a dolgozatban szereplő tartalmak, mérési eredmények és következtetések a saját munkám eredményei, amelyekért a teljes felelősséget vállalom.</w:t>
+      </w:r>
+    </w:p>
+    <w:p>
+      <w:pPr>
         <w:pStyle w:val="Heading1nonumbering"/>
         <w:ind w:hanging="0" w:left="0"/>
         <w:rPr>
@@ -11042,7 +12388,7 @@
       </w:pPr>
       <w:r>
         <w:rPr/>
-        <w:t>DVD vagy pendrive, amely tartalmazza a teljes szakdolgozatot *.docx és *.pdf formátumban, a védés során bemutatott prezentációt (*.pptx), valamint a SwarmCam rendszer forráskódját. A forráskód nyilvános tárolóban is elérhető, a dolgozat leadásakori állapotában: https://github.com/RiscyX/swarmcam</w:t>
+        <w:t>DVD, mely tartalmazza a teljes szakdolgozatot *.docx és *.pdf formátumban, valamint azt a prezentációt (*.pptx), melyet a hallgató a szakdolgozata védése során használ. A lemezre a SwarmCam rendszer teljes forráskódja is felkerül; a forráskód nyilvános tárolóban is elérhető, a dolgozat leadásakori állapotában: https://github.com/RiscyX/swarmcam</w:t>
       </w:r>
     </w:p>
     <w:sectPr>

</xml_diff>